<commit_message>
docs: aclarar riego aplicado y balance futuro
</commit_message>
<xml_diff>
--- a/docs/memoria/TFM_revision_coherencia_2026-10.docx
+++ b/docs/memoria/TFM_revision_coherencia_2026-10.docx
@@ -374,7 +374,7 @@
       <w:r>
         <w:fldChar w:fldCharType="separate"/>
       </w:r>
-      <w:hyperlink w:anchor="_Toc243635441" w:history="1">
+      <w:hyperlink w:anchor="_Toc243637974" w:history="1">
         <w:r>
           <w:rPr>
             <w:rStyle w:val="Hipervnculo"/>
@@ -401,7 +401,7 @@
             <w:noProof/>
             <w:webHidden/>
           </w:rPr>
-          <w:instrText xml:space="preserve"> PAGEREF _Toc243635441 \h </w:instrText>
+          <w:instrText xml:space="preserve"> PAGEREF _Toc243637974 \h </w:instrText>
         </w:r>
         <w:r>
           <w:rPr>
@@ -448,7 +448,7 @@
           <w14:ligatures w14:val="standardContextual"/>
         </w:rPr>
       </w:pPr>
-      <w:hyperlink w:anchor="_Toc243635442" w:history="1">
+      <w:hyperlink w:anchor="_Toc243637975" w:history="1">
         <w:r>
           <w:rPr>
             <w:rStyle w:val="Hipervnculo"/>
@@ -475,7 +475,7 @@
             <w:noProof/>
             <w:webHidden/>
           </w:rPr>
-          <w:instrText xml:space="preserve"> PAGEREF _Toc243635442 \h </w:instrText>
+          <w:instrText xml:space="preserve"> PAGEREF _Toc243637975 \h </w:instrText>
         </w:r>
         <w:r>
           <w:rPr>
@@ -522,7 +522,7 @@
           <w14:ligatures w14:val="standardContextual"/>
         </w:rPr>
       </w:pPr>
-      <w:hyperlink w:anchor="_Toc243635443" w:history="1">
+      <w:hyperlink w:anchor="_Toc243637976" w:history="1">
         <w:r>
           <w:rPr>
             <w:rStyle w:val="Hipervnculo"/>
@@ -549,7 +549,7 @@
             <w:noProof/>
             <w:webHidden/>
           </w:rPr>
-          <w:instrText xml:space="preserve"> PAGEREF _Toc243635443 \h </w:instrText>
+          <w:instrText xml:space="preserve"> PAGEREF _Toc243637976 \h </w:instrText>
         </w:r>
         <w:r>
           <w:rPr>
@@ -596,7 +596,7 @@
           <w14:ligatures w14:val="standardContextual"/>
         </w:rPr>
       </w:pPr>
-      <w:hyperlink w:anchor="_Toc243635444" w:history="1">
+      <w:hyperlink w:anchor="_Toc243637977" w:history="1">
         <w:r>
           <w:rPr>
             <w:rStyle w:val="Hipervnculo"/>
@@ -623,7 +623,7 @@
             <w:noProof/>
             <w:webHidden/>
           </w:rPr>
-          <w:instrText xml:space="preserve"> PAGEREF _Toc243635444 \h </w:instrText>
+          <w:instrText xml:space="preserve"> PAGEREF _Toc243637977 \h </w:instrText>
         </w:r>
         <w:r>
           <w:rPr>
@@ -670,7 +670,7 @@
           <w14:ligatures w14:val="standardContextual"/>
         </w:rPr>
       </w:pPr>
-      <w:hyperlink w:anchor="_Toc243635445" w:history="1">
+      <w:hyperlink w:anchor="_Toc243637978" w:history="1">
         <w:r>
           <w:rPr>
             <w:rStyle w:val="Hipervnculo"/>
@@ -697,7 +697,7 @@
             <w:noProof/>
             <w:webHidden/>
           </w:rPr>
-          <w:instrText xml:space="preserve"> PAGEREF _Toc243635445 \h </w:instrText>
+          <w:instrText xml:space="preserve"> PAGEREF _Toc243637978 \h </w:instrText>
         </w:r>
         <w:r>
           <w:rPr>
@@ -744,7 +744,7 @@
           <w14:ligatures w14:val="standardContextual"/>
         </w:rPr>
       </w:pPr>
-      <w:hyperlink w:anchor="_Toc243635446" w:history="1">
+      <w:hyperlink w:anchor="_Toc243637979" w:history="1">
         <w:r>
           <w:rPr>
             <w:rStyle w:val="Hipervnculo"/>
@@ -771,7 +771,7 @@
             <w:noProof/>
             <w:webHidden/>
           </w:rPr>
-          <w:instrText xml:space="preserve"> PAGEREF _Toc243635446 \h </w:instrText>
+          <w:instrText xml:space="preserve"> PAGEREF _Toc243637979 \h </w:instrText>
         </w:r>
         <w:r>
           <w:rPr>
@@ -818,7 +818,7 @@
           <w14:ligatures w14:val="standardContextual"/>
         </w:rPr>
       </w:pPr>
-      <w:hyperlink w:anchor="_Toc243635447" w:history="1">
+      <w:hyperlink w:anchor="_Toc243637980" w:history="1">
         <w:r>
           <w:rPr>
             <w:rStyle w:val="Hipervnculo"/>
@@ -845,7 +845,7 @@
             <w:noProof/>
             <w:webHidden/>
           </w:rPr>
-          <w:instrText xml:space="preserve"> PAGEREF _Toc243635447 \h </w:instrText>
+          <w:instrText xml:space="preserve"> PAGEREF _Toc243637980 \h </w:instrText>
         </w:r>
         <w:r>
           <w:rPr>
@@ -892,7 +892,7 @@
           <w14:ligatures w14:val="standardContextual"/>
         </w:rPr>
       </w:pPr>
-      <w:hyperlink w:anchor="_Toc243635448" w:history="1">
+      <w:hyperlink w:anchor="_Toc243637981" w:history="1">
         <w:r>
           <w:rPr>
             <w:rStyle w:val="Hipervnculo"/>
@@ -919,7 +919,7 @@
             <w:noProof/>
             <w:webHidden/>
           </w:rPr>
-          <w:instrText xml:space="preserve"> PAGEREF _Toc243635448 \h </w:instrText>
+          <w:instrText xml:space="preserve"> PAGEREF _Toc243637981 \h </w:instrText>
         </w:r>
         <w:r>
           <w:rPr>
@@ -966,7 +966,7 @@
           <w14:ligatures w14:val="standardContextual"/>
         </w:rPr>
       </w:pPr>
-      <w:hyperlink w:anchor="_Toc243635449" w:history="1">
+      <w:hyperlink w:anchor="_Toc243637982" w:history="1">
         <w:r>
           <w:rPr>
             <w:rStyle w:val="Hipervnculo"/>
@@ -993,7 +993,7 @@
             <w:noProof/>
             <w:webHidden/>
           </w:rPr>
-          <w:instrText xml:space="preserve"> PAGEREF _Toc243635449 \h </w:instrText>
+          <w:instrText xml:space="preserve"> PAGEREF _Toc243637982 \h </w:instrText>
         </w:r>
         <w:r>
           <w:rPr>
@@ -1040,7 +1040,7 @@
           <w14:ligatures w14:val="standardContextual"/>
         </w:rPr>
       </w:pPr>
-      <w:hyperlink w:anchor="_Toc243635450" w:history="1">
+      <w:hyperlink w:anchor="_Toc243637983" w:history="1">
         <w:r>
           <w:rPr>
             <w:rStyle w:val="Hipervnculo"/>
@@ -1067,7 +1067,7 @@
             <w:noProof/>
             <w:webHidden/>
           </w:rPr>
-          <w:instrText xml:space="preserve"> PAGEREF _Toc243635450 \h </w:instrText>
+          <w:instrText xml:space="preserve"> PAGEREF _Toc243637983 \h </w:instrText>
         </w:r>
         <w:r>
           <w:rPr>
@@ -1114,7 +1114,7 @@
           <w14:ligatures w14:val="standardContextual"/>
         </w:rPr>
       </w:pPr>
-      <w:hyperlink w:anchor="_Toc243635451" w:history="1">
+      <w:hyperlink w:anchor="_Toc243637984" w:history="1">
         <w:r>
           <w:rPr>
             <w:rStyle w:val="Hipervnculo"/>
@@ -1141,7 +1141,7 @@
             <w:noProof/>
             <w:webHidden/>
           </w:rPr>
-          <w:instrText xml:space="preserve"> PAGEREF _Toc243635451 \h </w:instrText>
+          <w:instrText xml:space="preserve"> PAGEREF _Toc243637984 \h </w:instrText>
         </w:r>
         <w:r>
           <w:rPr>
@@ -1188,7 +1188,7 @@
           <w14:ligatures w14:val="standardContextual"/>
         </w:rPr>
       </w:pPr>
-      <w:hyperlink w:anchor="_Toc243635452" w:history="1">
+      <w:hyperlink w:anchor="_Toc243637985" w:history="1">
         <w:r>
           <w:rPr>
             <w:rStyle w:val="Hipervnculo"/>
@@ -1215,7 +1215,7 @@
             <w:noProof/>
             <w:webHidden/>
           </w:rPr>
-          <w:instrText xml:space="preserve"> PAGEREF _Toc243635452 \h </w:instrText>
+          <w:instrText xml:space="preserve"> PAGEREF _Toc243637985 \h </w:instrText>
         </w:r>
         <w:r>
           <w:rPr>
@@ -1262,7 +1262,7 @@
           <w14:ligatures w14:val="standardContextual"/>
         </w:rPr>
       </w:pPr>
-      <w:hyperlink w:anchor="_Toc243635453" w:history="1">
+      <w:hyperlink w:anchor="_Toc243637986" w:history="1">
         <w:r>
           <w:rPr>
             <w:rStyle w:val="Hipervnculo"/>
@@ -1289,7 +1289,7 @@
             <w:noProof/>
             <w:webHidden/>
           </w:rPr>
-          <w:instrText xml:space="preserve"> PAGEREF _Toc243635453 \h </w:instrText>
+          <w:instrText xml:space="preserve"> PAGEREF _Toc243637986 \h </w:instrText>
         </w:r>
         <w:r>
           <w:rPr>
@@ -1336,7 +1336,7 @@
           <w14:ligatures w14:val="standardContextual"/>
         </w:rPr>
       </w:pPr>
-      <w:hyperlink w:anchor="_Toc243635454" w:history="1">
+      <w:hyperlink w:anchor="_Toc243637987" w:history="1">
         <w:r>
           <w:rPr>
             <w:rStyle w:val="Hipervnculo"/>
@@ -1363,7 +1363,7 @@
             <w:noProof/>
             <w:webHidden/>
           </w:rPr>
-          <w:instrText xml:space="preserve"> PAGEREF _Toc243635454 \h </w:instrText>
+          <w:instrText xml:space="preserve"> PAGEREF _Toc243637987 \h </w:instrText>
         </w:r>
         <w:r>
           <w:rPr>
@@ -1410,7 +1410,7 @@
           <w14:ligatures w14:val="standardContextual"/>
         </w:rPr>
       </w:pPr>
-      <w:hyperlink w:anchor="_Toc243635455" w:history="1">
+      <w:hyperlink w:anchor="_Toc243637988" w:history="1">
         <w:r>
           <w:rPr>
             <w:rStyle w:val="Hipervnculo"/>
@@ -1437,7 +1437,7 @@
             <w:noProof/>
             <w:webHidden/>
           </w:rPr>
-          <w:instrText xml:space="preserve"> PAGEREF _Toc243635455 \h </w:instrText>
+          <w:instrText xml:space="preserve"> PAGEREF _Toc243637988 \h </w:instrText>
         </w:r>
         <w:r>
           <w:rPr>
@@ -1484,7 +1484,7 @@
           <w14:ligatures w14:val="standardContextual"/>
         </w:rPr>
       </w:pPr>
-      <w:hyperlink w:anchor="_Toc243635456" w:history="1">
+      <w:hyperlink w:anchor="_Toc243637989" w:history="1">
         <w:r>
           <w:rPr>
             <w:rStyle w:val="Hipervnculo"/>
@@ -1511,7 +1511,7 @@
             <w:noProof/>
             <w:webHidden/>
           </w:rPr>
-          <w:instrText xml:space="preserve"> PAGEREF _Toc243635456 \h </w:instrText>
+          <w:instrText xml:space="preserve"> PAGEREF _Toc243637989 \h </w:instrText>
         </w:r>
         <w:r>
           <w:rPr>
@@ -1558,7 +1558,7 @@
           <w14:ligatures w14:val="standardContextual"/>
         </w:rPr>
       </w:pPr>
-      <w:hyperlink w:anchor="_Toc243635457" w:history="1">
+      <w:hyperlink w:anchor="_Toc243637990" w:history="1">
         <w:r>
           <w:rPr>
             <w:rStyle w:val="Hipervnculo"/>
@@ -1585,7 +1585,7 @@
             <w:noProof/>
             <w:webHidden/>
           </w:rPr>
-          <w:instrText xml:space="preserve"> PAGEREF _Toc243635457 \h </w:instrText>
+          <w:instrText xml:space="preserve"> PAGEREF _Toc243637990 \h </w:instrText>
         </w:r>
         <w:r>
           <w:rPr>
@@ -1632,7 +1632,7 @@
           <w14:ligatures w14:val="standardContextual"/>
         </w:rPr>
       </w:pPr>
-      <w:hyperlink w:anchor="_Toc243635458" w:history="1">
+      <w:hyperlink w:anchor="_Toc243637991" w:history="1">
         <w:r>
           <w:rPr>
             <w:rStyle w:val="Hipervnculo"/>
@@ -1659,7 +1659,7 @@
             <w:noProof/>
             <w:webHidden/>
           </w:rPr>
-          <w:instrText xml:space="preserve"> PAGEREF _Toc243635458 \h </w:instrText>
+          <w:instrText xml:space="preserve"> PAGEREF _Toc243637991 \h </w:instrText>
         </w:r>
         <w:r>
           <w:rPr>
@@ -1706,7 +1706,7 @@
           <w14:ligatures w14:val="standardContextual"/>
         </w:rPr>
       </w:pPr>
-      <w:hyperlink w:anchor="_Toc243635459" w:history="1">
+      <w:hyperlink w:anchor="_Toc243637992" w:history="1">
         <w:r>
           <w:rPr>
             <w:rStyle w:val="Hipervnculo"/>
@@ -1733,7 +1733,7 @@
             <w:noProof/>
             <w:webHidden/>
           </w:rPr>
-          <w:instrText xml:space="preserve"> PAGEREF _Toc243635459 \h </w:instrText>
+          <w:instrText xml:space="preserve"> PAGEREF _Toc243637992 \h </w:instrText>
         </w:r>
         <w:r>
           <w:rPr>
@@ -1780,7 +1780,7 @@
           <w14:ligatures w14:val="standardContextual"/>
         </w:rPr>
       </w:pPr>
-      <w:hyperlink w:anchor="_Toc243635460" w:history="1">
+      <w:hyperlink w:anchor="_Toc243637993" w:history="1">
         <w:r>
           <w:rPr>
             <w:rStyle w:val="Hipervnculo"/>
@@ -1807,7 +1807,7 @@
             <w:noProof/>
             <w:webHidden/>
           </w:rPr>
-          <w:instrText xml:space="preserve"> PAGEREF _Toc243635460 \h </w:instrText>
+          <w:instrText xml:space="preserve"> PAGEREF _Toc243637993 \h </w:instrText>
         </w:r>
         <w:r>
           <w:rPr>
@@ -1854,7 +1854,7 @@
           <w14:ligatures w14:val="standardContextual"/>
         </w:rPr>
       </w:pPr>
-      <w:hyperlink w:anchor="_Toc243635461" w:history="1">
+      <w:hyperlink w:anchor="_Toc243637994" w:history="1">
         <w:r>
           <w:rPr>
             <w:rStyle w:val="Hipervnculo"/>
@@ -1881,7 +1881,7 @@
             <w:noProof/>
             <w:webHidden/>
           </w:rPr>
-          <w:instrText xml:space="preserve"> PAGEREF _Toc243635461 \h </w:instrText>
+          <w:instrText xml:space="preserve"> PAGEREF _Toc243637994 \h </w:instrText>
         </w:r>
         <w:r>
           <w:rPr>
@@ -1928,7 +1928,7 @@
           <w14:ligatures w14:val="standardContextual"/>
         </w:rPr>
       </w:pPr>
-      <w:hyperlink w:anchor="_Toc243635462" w:history="1">
+      <w:hyperlink w:anchor="_Toc243637995" w:history="1">
         <w:r>
           <w:rPr>
             <w:rStyle w:val="Hipervnculo"/>
@@ -1955,7 +1955,7 @@
             <w:noProof/>
             <w:webHidden/>
           </w:rPr>
-          <w:instrText xml:space="preserve"> PAGEREF _Toc243635462 \h </w:instrText>
+          <w:instrText xml:space="preserve"> PAGEREF _Toc243637995 \h </w:instrText>
         </w:r>
         <w:r>
           <w:rPr>
@@ -2002,7 +2002,7 @@
           <w14:ligatures w14:val="standardContextual"/>
         </w:rPr>
       </w:pPr>
-      <w:hyperlink w:anchor="_Toc243635463" w:history="1">
+      <w:hyperlink w:anchor="_Toc243637996" w:history="1">
         <w:r>
           <w:rPr>
             <w:rStyle w:val="Hipervnculo"/>
@@ -2029,7 +2029,7 @@
             <w:noProof/>
             <w:webHidden/>
           </w:rPr>
-          <w:instrText xml:space="preserve"> PAGEREF _Toc243635463 \h </w:instrText>
+          <w:instrText xml:space="preserve"> PAGEREF _Toc243637996 \h </w:instrText>
         </w:r>
         <w:r>
           <w:rPr>
@@ -2076,7 +2076,7 @@
           <w14:ligatures w14:val="standardContextual"/>
         </w:rPr>
       </w:pPr>
-      <w:hyperlink w:anchor="_Toc243635464" w:history="1">
+      <w:hyperlink w:anchor="_Toc243637997" w:history="1">
         <w:r>
           <w:rPr>
             <w:rStyle w:val="Hipervnculo"/>
@@ -2103,7 +2103,7 @@
             <w:noProof/>
             <w:webHidden/>
           </w:rPr>
-          <w:instrText xml:space="preserve"> PAGEREF _Toc243635464 \h </w:instrText>
+          <w:instrText xml:space="preserve"> PAGEREF _Toc243637997 \h </w:instrText>
         </w:r>
         <w:r>
           <w:rPr>
@@ -2150,7 +2150,7 @@
           <w14:ligatures w14:val="standardContextual"/>
         </w:rPr>
       </w:pPr>
-      <w:hyperlink w:anchor="_Toc243635465" w:history="1">
+      <w:hyperlink w:anchor="_Toc243637998" w:history="1">
         <w:r>
           <w:rPr>
             <w:rStyle w:val="Hipervnculo"/>
@@ -2177,7 +2177,7 @@
             <w:noProof/>
             <w:webHidden/>
           </w:rPr>
-          <w:instrText xml:space="preserve"> PAGEREF _Toc243635465 \h </w:instrText>
+          <w:instrText xml:space="preserve"> PAGEREF _Toc243637998 \h </w:instrText>
         </w:r>
         <w:r>
           <w:rPr>
@@ -2224,7 +2224,7 @@
           <w14:ligatures w14:val="standardContextual"/>
         </w:rPr>
       </w:pPr>
-      <w:hyperlink w:anchor="_Toc243635466" w:history="1">
+      <w:hyperlink w:anchor="_Toc243637999" w:history="1">
         <w:r>
           <w:rPr>
             <w:rStyle w:val="Hipervnculo"/>
@@ -2251,7 +2251,7 @@
             <w:noProof/>
             <w:webHidden/>
           </w:rPr>
-          <w:instrText xml:space="preserve"> PAGEREF _Toc243635466 \h </w:instrText>
+          <w:instrText xml:space="preserve"> PAGEREF _Toc243637999 \h </w:instrText>
         </w:r>
         <w:r>
           <w:rPr>
@@ -2298,7 +2298,7 @@
           <w14:ligatures w14:val="standardContextual"/>
         </w:rPr>
       </w:pPr>
-      <w:hyperlink w:anchor="_Toc243635467" w:history="1">
+      <w:hyperlink w:anchor="_Toc243638000" w:history="1">
         <w:r>
           <w:rPr>
             <w:rStyle w:val="Hipervnculo"/>
@@ -2325,7 +2325,7 @@
             <w:noProof/>
             <w:webHidden/>
           </w:rPr>
-          <w:instrText xml:space="preserve"> PAGEREF _Toc243635467 \h </w:instrText>
+          <w:instrText xml:space="preserve"> PAGEREF _Toc243638000 \h </w:instrText>
         </w:r>
         <w:r>
           <w:rPr>
@@ -2372,7 +2372,7 @@
           <w14:ligatures w14:val="standardContextual"/>
         </w:rPr>
       </w:pPr>
-      <w:hyperlink w:anchor="_Toc243635468" w:history="1">
+      <w:hyperlink w:anchor="_Toc243638001" w:history="1">
         <w:r>
           <w:rPr>
             <w:rStyle w:val="Hipervnculo"/>
@@ -2399,7 +2399,7 @@
             <w:noProof/>
             <w:webHidden/>
           </w:rPr>
-          <w:instrText xml:space="preserve"> PAGEREF _Toc243635468 \h </w:instrText>
+          <w:instrText xml:space="preserve"> PAGEREF _Toc243638001 \h </w:instrText>
         </w:r>
         <w:r>
           <w:rPr>
@@ -2446,7 +2446,7 @@
           <w14:ligatures w14:val="standardContextual"/>
         </w:rPr>
       </w:pPr>
-      <w:hyperlink w:anchor="_Toc243635469" w:history="1">
+      <w:hyperlink w:anchor="_Toc243638002" w:history="1">
         <w:r>
           <w:rPr>
             <w:rStyle w:val="Hipervnculo"/>
@@ -2473,7 +2473,7 @@
             <w:noProof/>
             <w:webHidden/>
           </w:rPr>
-          <w:instrText xml:space="preserve"> PAGEREF _Toc243635469 \h </w:instrText>
+          <w:instrText xml:space="preserve"> PAGEREF _Toc243638002 \h </w:instrText>
         </w:r>
         <w:r>
           <w:rPr>
@@ -2520,7 +2520,7 @@
           <w14:ligatures w14:val="standardContextual"/>
         </w:rPr>
       </w:pPr>
-      <w:hyperlink w:anchor="_Toc243635470" w:history="1">
+      <w:hyperlink w:anchor="_Toc243638003" w:history="1">
         <w:r>
           <w:rPr>
             <w:rStyle w:val="Hipervnculo"/>
@@ -2547,7 +2547,7 @@
             <w:noProof/>
             <w:webHidden/>
           </w:rPr>
-          <w:instrText xml:space="preserve"> PAGEREF _Toc243635470 \h </w:instrText>
+          <w:instrText xml:space="preserve"> PAGEREF _Toc243638003 \h </w:instrText>
         </w:r>
         <w:r>
           <w:rPr>
@@ -2594,7 +2594,7 @@
           <w14:ligatures w14:val="standardContextual"/>
         </w:rPr>
       </w:pPr>
-      <w:hyperlink w:anchor="_Toc243635471" w:history="1">
+      <w:hyperlink w:anchor="_Toc243638004" w:history="1">
         <w:r>
           <w:rPr>
             <w:rStyle w:val="Hipervnculo"/>
@@ -2621,7 +2621,7 @@
             <w:noProof/>
             <w:webHidden/>
           </w:rPr>
-          <w:instrText xml:space="preserve"> PAGEREF _Toc243635471 \h </w:instrText>
+          <w:instrText xml:space="preserve"> PAGEREF _Toc243638004 \h </w:instrText>
         </w:r>
         <w:r>
           <w:rPr>
@@ -2668,7 +2668,7 @@
           <w14:ligatures w14:val="standardContextual"/>
         </w:rPr>
       </w:pPr>
-      <w:hyperlink w:anchor="_Toc243635472" w:history="1">
+      <w:hyperlink w:anchor="_Toc243638005" w:history="1">
         <w:r>
           <w:rPr>
             <w:rStyle w:val="Hipervnculo"/>
@@ -2695,7 +2695,7 @@
             <w:noProof/>
             <w:webHidden/>
           </w:rPr>
-          <w:instrText xml:space="preserve"> PAGEREF _Toc243635472 \h </w:instrText>
+          <w:instrText xml:space="preserve"> PAGEREF _Toc243638005 \h </w:instrText>
         </w:r>
         <w:r>
           <w:rPr>
@@ -2742,7 +2742,7 @@
           <w14:ligatures w14:val="standardContextual"/>
         </w:rPr>
       </w:pPr>
-      <w:hyperlink w:anchor="_Toc243635473" w:history="1">
+      <w:hyperlink w:anchor="_Toc243638006" w:history="1">
         <w:r>
           <w:rPr>
             <w:rStyle w:val="Hipervnculo"/>
@@ -2769,7 +2769,7 @@
             <w:noProof/>
             <w:webHidden/>
           </w:rPr>
-          <w:instrText xml:space="preserve"> PAGEREF _Toc243635473 \h </w:instrText>
+          <w:instrText xml:space="preserve"> PAGEREF _Toc243638006 \h </w:instrText>
         </w:r>
         <w:r>
           <w:rPr>
@@ -2816,7 +2816,7 @@
           <w14:ligatures w14:val="standardContextual"/>
         </w:rPr>
       </w:pPr>
-      <w:hyperlink w:anchor="_Toc243635474" w:history="1">
+      <w:hyperlink w:anchor="_Toc243638007" w:history="1">
         <w:r>
           <w:rPr>
             <w:rStyle w:val="Hipervnculo"/>
@@ -2843,7 +2843,7 @@
             <w:noProof/>
             <w:webHidden/>
           </w:rPr>
-          <w:instrText xml:space="preserve"> PAGEREF _Toc243635474 \h </w:instrText>
+          <w:instrText xml:space="preserve"> PAGEREF _Toc243638007 \h </w:instrText>
         </w:r>
         <w:r>
           <w:rPr>
@@ -2890,7 +2890,7 @@
           <w14:ligatures w14:val="standardContextual"/>
         </w:rPr>
       </w:pPr>
-      <w:hyperlink w:anchor="_Toc243635475" w:history="1">
+      <w:hyperlink w:anchor="_Toc243638008" w:history="1">
         <w:r>
           <w:rPr>
             <w:rStyle w:val="Hipervnculo"/>
@@ -2917,7 +2917,7 @@
             <w:noProof/>
             <w:webHidden/>
           </w:rPr>
-          <w:instrText xml:space="preserve"> PAGEREF _Toc243635475 \h </w:instrText>
+          <w:instrText xml:space="preserve"> PAGEREF _Toc243638008 \h </w:instrText>
         </w:r>
         <w:r>
           <w:rPr>
@@ -2964,7 +2964,7 @@
           <w14:ligatures w14:val="standardContextual"/>
         </w:rPr>
       </w:pPr>
-      <w:hyperlink w:anchor="_Toc243635476" w:history="1">
+      <w:hyperlink w:anchor="_Toc243638009" w:history="1">
         <w:r>
           <w:rPr>
             <w:rStyle w:val="Hipervnculo"/>
@@ -2991,7 +2991,7 @@
             <w:noProof/>
             <w:webHidden/>
           </w:rPr>
-          <w:instrText xml:space="preserve"> PAGEREF _Toc243635476 \h </w:instrText>
+          <w:instrText xml:space="preserve"> PAGEREF _Toc243638009 \h </w:instrText>
         </w:r>
         <w:r>
           <w:rPr>
@@ -3038,7 +3038,7 @@
           <w14:ligatures w14:val="standardContextual"/>
         </w:rPr>
       </w:pPr>
-      <w:hyperlink w:anchor="_Toc243635477" w:history="1">
+      <w:hyperlink w:anchor="_Toc243638010" w:history="1">
         <w:r>
           <w:rPr>
             <w:rStyle w:val="Hipervnculo"/>
@@ -3065,7 +3065,7 @@
             <w:noProof/>
             <w:webHidden/>
           </w:rPr>
-          <w:instrText xml:space="preserve"> PAGEREF _Toc243635477 \h </w:instrText>
+          <w:instrText xml:space="preserve"> PAGEREF _Toc243638010 \h </w:instrText>
         </w:r>
         <w:r>
           <w:rPr>
@@ -3112,7 +3112,7 @@
           <w14:ligatures w14:val="standardContextual"/>
         </w:rPr>
       </w:pPr>
-      <w:hyperlink w:anchor="_Toc243635478" w:history="1">
+      <w:hyperlink w:anchor="_Toc243638011" w:history="1">
         <w:r>
           <w:rPr>
             <w:rStyle w:val="Hipervnculo"/>
@@ -3139,7 +3139,7 @@
             <w:noProof/>
             <w:webHidden/>
           </w:rPr>
-          <w:instrText xml:space="preserve"> PAGEREF _Toc243635478 \h </w:instrText>
+          <w:instrText xml:space="preserve"> PAGEREF _Toc243638011 \h </w:instrText>
         </w:r>
         <w:r>
           <w:rPr>
@@ -3186,7 +3186,7 @@
           <w14:ligatures w14:val="standardContextual"/>
         </w:rPr>
       </w:pPr>
-      <w:hyperlink w:anchor="_Toc243635479" w:history="1">
+      <w:hyperlink w:anchor="_Toc243638012" w:history="1">
         <w:r>
           <w:rPr>
             <w:rStyle w:val="Hipervnculo"/>
@@ -3213,7 +3213,7 @@
             <w:noProof/>
             <w:webHidden/>
           </w:rPr>
-          <w:instrText xml:space="preserve"> PAGEREF _Toc243635479 \h </w:instrText>
+          <w:instrText xml:space="preserve"> PAGEREF _Toc243638012 \h </w:instrText>
         </w:r>
         <w:r>
           <w:rPr>
@@ -3260,7 +3260,7 @@
           <w14:ligatures w14:val="standardContextual"/>
         </w:rPr>
       </w:pPr>
-      <w:hyperlink w:anchor="_Toc243635480" w:history="1">
+      <w:hyperlink w:anchor="_Toc243638013" w:history="1">
         <w:r>
           <w:rPr>
             <w:rStyle w:val="Hipervnculo"/>
@@ -3287,7 +3287,7 @@
             <w:noProof/>
             <w:webHidden/>
           </w:rPr>
-          <w:instrText xml:space="preserve"> PAGEREF _Toc243635480 \h </w:instrText>
+          <w:instrText xml:space="preserve"> PAGEREF _Toc243638013 \h </w:instrText>
         </w:r>
         <w:r>
           <w:rPr>
@@ -3334,7 +3334,7 @@
           <w14:ligatures w14:val="standardContextual"/>
         </w:rPr>
       </w:pPr>
-      <w:hyperlink w:anchor="_Toc243635481" w:history="1">
+      <w:hyperlink w:anchor="_Toc243638014" w:history="1">
         <w:r>
           <w:rPr>
             <w:rStyle w:val="Hipervnculo"/>
@@ -3361,7 +3361,7 @@
             <w:noProof/>
             <w:webHidden/>
           </w:rPr>
-          <w:instrText xml:space="preserve"> PAGEREF _Toc243635481 \h </w:instrText>
+          <w:instrText xml:space="preserve"> PAGEREF _Toc243638014 \h </w:instrText>
         </w:r>
         <w:r>
           <w:rPr>
@@ -3408,7 +3408,7 @@
           <w14:ligatures w14:val="standardContextual"/>
         </w:rPr>
       </w:pPr>
-      <w:hyperlink w:anchor="_Toc243635482" w:history="1">
+      <w:hyperlink w:anchor="_Toc243638015" w:history="1">
         <w:r>
           <w:rPr>
             <w:rStyle w:val="Hipervnculo"/>
@@ -3435,7 +3435,7 @@
             <w:noProof/>
             <w:webHidden/>
           </w:rPr>
-          <w:instrText xml:space="preserve"> PAGEREF _Toc243635482 \h </w:instrText>
+          <w:instrText xml:space="preserve"> PAGEREF _Toc243638015 \h </w:instrText>
         </w:r>
         <w:r>
           <w:rPr>
@@ -3482,7 +3482,7 @@
           <w14:ligatures w14:val="standardContextual"/>
         </w:rPr>
       </w:pPr>
-      <w:hyperlink w:anchor="_Toc243635483" w:history="1">
+      <w:hyperlink w:anchor="_Toc243638016" w:history="1">
         <w:r>
           <w:rPr>
             <w:rStyle w:val="Hipervnculo"/>
@@ -3509,7 +3509,7 @@
             <w:noProof/>
             <w:webHidden/>
           </w:rPr>
-          <w:instrText xml:space="preserve"> PAGEREF _Toc243635483 \h </w:instrText>
+          <w:instrText xml:space="preserve"> PAGEREF _Toc243638016 \h </w:instrText>
         </w:r>
         <w:r>
           <w:rPr>
@@ -3556,7 +3556,7 @@
           <w14:ligatures w14:val="standardContextual"/>
         </w:rPr>
       </w:pPr>
-      <w:hyperlink w:anchor="_Toc243635484" w:history="1">
+      <w:hyperlink w:anchor="_Toc243638017" w:history="1">
         <w:r>
           <w:rPr>
             <w:rStyle w:val="Hipervnculo"/>
@@ -3583,7 +3583,7 @@
             <w:noProof/>
             <w:webHidden/>
           </w:rPr>
-          <w:instrText xml:space="preserve"> PAGEREF _Toc243635484 \h </w:instrText>
+          <w:instrText xml:space="preserve"> PAGEREF _Toc243638017 \h </w:instrText>
         </w:r>
         <w:r>
           <w:rPr>
@@ -3630,7 +3630,7 @@
           <w14:ligatures w14:val="standardContextual"/>
         </w:rPr>
       </w:pPr>
-      <w:hyperlink w:anchor="_Toc243635485" w:history="1">
+      <w:hyperlink w:anchor="_Toc243638018" w:history="1">
         <w:r>
           <w:rPr>
             <w:rStyle w:val="Hipervnculo"/>
@@ -3657,7 +3657,7 @@
             <w:noProof/>
             <w:webHidden/>
           </w:rPr>
-          <w:instrText xml:space="preserve"> PAGEREF _Toc243635485 \h </w:instrText>
+          <w:instrText xml:space="preserve"> PAGEREF _Toc243638018 \h </w:instrText>
         </w:r>
         <w:r>
           <w:rPr>
@@ -3704,7 +3704,7 @@
           <w14:ligatures w14:val="standardContextual"/>
         </w:rPr>
       </w:pPr>
-      <w:hyperlink w:anchor="_Toc243635486" w:history="1">
+      <w:hyperlink w:anchor="_Toc243638019" w:history="1">
         <w:r>
           <w:rPr>
             <w:rStyle w:val="Hipervnculo"/>
@@ -3731,7 +3731,7 @@
             <w:noProof/>
             <w:webHidden/>
           </w:rPr>
-          <w:instrText xml:space="preserve"> PAGEREF _Toc243635486 \h </w:instrText>
+          <w:instrText xml:space="preserve"> PAGEREF _Toc243638019 \h </w:instrText>
         </w:r>
         <w:r>
           <w:rPr>
@@ -3778,7 +3778,7 @@
           <w14:ligatures w14:val="standardContextual"/>
         </w:rPr>
       </w:pPr>
-      <w:hyperlink w:anchor="_Toc243635487" w:history="1">
+      <w:hyperlink w:anchor="_Toc243638020" w:history="1">
         <w:r>
           <w:rPr>
             <w:rStyle w:val="Hipervnculo"/>
@@ -3805,7 +3805,7 @@
             <w:noProof/>
             <w:webHidden/>
           </w:rPr>
-          <w:instrText xml:space="preserve"> PAGEREF _Toc243635487 \h </w:instrText>
+          <w:instrText xml:space="preserve"> PAGEREF _Toc243638020 \h </w:instrText>
         </w:r>
         <w:r>
           <w:rPr>
@@ -3852,7 +3852,7 @@
           <w14:ligatures w14:val="standardContextual"/>
         </w:rPr>
       </w:pPr>
-      <w:hyperlink w:anchor="_Toc243635488" w:history="1">
+      <w:hyperlink w:anchor="_Toc243638021" w:history="1">
         <w:r>
           <w:rPr>
             <w:rStyle w:val="Hipervnculo"/>
@@ -3879,7 +3879,7 @@
             <w:noProof/>
             <w:webHidden/>
           </w:rPr>
-          <w:instrText xml:space="preserve"> PAGEREF _Toc243635488 \h </w:instrText>
+          <w:instrText xml:space="preserve"> PAGEREF _Toc243638021 \h </w:instrText>
         </w:r>
         <w:r>
           <w:rPr>
@@ -3926,7 +3926,7 @@
           <w14:ligatures w14:val="standardContextual"/>
         </w:rPr>
       </w:pPr>
-      <w:hyperlink w:anchor="_Toc243635489" w:history="1">
+      <w:hyperlink w:anchor="_Toc243638022" w:history="1">
         <w:r>
           <w:rPr>
             <w:rStyle w:val="Hipervnculo"/>
@@ -3953,7 +3953,7 @@
             <w:noProof/>
             <w:webHidden/>
           </w:rPr>
-          <w:instrText xml:space="preserve"> PAGEREF _Toc243635489 \h </w:instrText>
+          <w:instrText xml:space="preserve"> PAGEREF _Toc243638022 \h </w:instrText>
         </w:r>
         <w:r>
           <w:rPr>
@@ -4000,7 +4000,7 @@
           <w14:ligatures w14:val="standardContextual"/>
         </w:rPr>
       </w:pPr>
-      <w:hyperlink w:anchor="_Toc243635490" w:history="1">
+      <w:hyperlink w:anchor="_Toc243638023" w:history="1">
         <w:r>
           <w:rPr>
             <w:rStyle w:val="Hipervnculo"/>
@@ -4027,7 +4027,7 @@
             <w:noProof/>
             <w:webHidden/>
           </w:rPr>
-          <w:instrText xml:space="preserve"> PAGEREF _Toc243635490 \h </w:instrText>
+          <w:instrText xml:space="preserve"> PAGEREF _Toc243638023 \h </w:instrText>
         </w:r>
         <w:r>
           <w:rPr>
@@ -4074,7 +4074,7 @@
           <w14:ligatures w14:val="standardContextual"/>
         </w:rPr>
       </w:pPr>
-      <w:hyperlink w:anchor="_Toc243635491" w:history="1">
+      <w:hyperlink w:anchor="_Toc243638024" w:history="1">
         <w:r>
           <w:rPr>
             <w:rStyle w:val="Hipervnculo"/>
@@ -4101,7 +4101,7 @@
             <w:noProof/>
             <w:webHidden/>
           </w:rPr>
-          <w:instrText xml:space="preserve"> PAGEREF _Toc243635491 \h </w:instrText>
+          <w:instrText xml:space="preserve"> PAGEREF _Toc243638024 \h </w:instrText>
         </w:r>
         <w:r>
           <w:rPr>
@@ -4148,7 +4148,7 @@
           <w14:ligatures w14:val="standardContextual"/>
         </w:rPr>
       </w:pPr>
-      <w:hyperlink w:anchor="_Toc243635492" w:history="1">
+      <w:hyperlink w:anchor="_Toc243638025" w:history="1">
         <w:r>
           <w:rPr>
             <w:rStyle w:val="Hipervnculo"/>
@@ -4175,7 +4175,7 @@
             <w:noProof/>
             <w:webHidden/>
           </w:rPr>
-          <w:instrText xml:space="preserve"> PAGEREF _Toc243635492 \h </w:instrText>
+          <w:instrText xml:space="preserve"> PAGEREF _Toc243638025 \h </w:instrText>
         </w:r>
         <w:r>
           <w:rPr>
@@ -4222,7 +4222,7 @@
           <w14:ligatures w14:val="standardContextual"/>
         </w:rPr>
       </w:pPr>
-      <w:hyperlink w:anchor="_Toc243635493" w:history="1">
+      <w:hyperlink w:anchor="_Toc243638026" w:history="1">
         <w:r>
           <w:rPr>
             <w:rStyle w:val="Hipervnculo"/>
@@ -4249,7 +4249,7 @@
             <w:noProof/>
             <w:webHidden/>
           </w:rPr>
-          <w:instrText xml:space="preserve"> PAGEREF _Toc243635493 \h </w:instrText>
+          <w:instrText xml:space="preserve"> PAGEREF _Toc243638026 \h </w:instrText>
         </w:r>
         <w:r>
           <w:rPr>
@@ -4296,7 +4296,7 @@
           <w14:ligatures w14:val="standardContextual"/>
         </w:rPr>
       </w:pPr>
-      <w:hyperlink w:anchor="_Toc243635494" w:history="1">
+      <w:hyperlink w:anchor="_Toc243638027" w:history="1">
         <w:r>
           <w:rPr>
             <w:rStyle w:val="Hipervnculo"/>
@@ -4323,7 +4323,7 @@
             <w:noProof/>
             <w:webHidden/>
           </w:rPr>
-          <w:instrText xml:space="preserve"> PAGEREF _Toc243635494 \h </w:instrText>
+          <w:instrText xml:space="preserve"> PAGEREF _Toc243638027 \h </w:instrText>
         </w:r>
         <w:r>
           <w:rPr>
@@ -4370,7 +4370,7 @@
           <w14:ligatures w14:val="standardContextual"/>
         </w:rPr>
       </w:pPr>
-      <w:hyperlink w:anchor="_Toc243635495" w:history="1">
+      <w:hyperlink w:anchor="_Toc243638028" w:history="1">
         <w:r>
           <w:rPr>
             <w:rStyle w:val="Hipervnculo"/>
@@ -4397,7 +4397,7 @@
             <w:noProof/>
             <w:webHidden/>
           </w:rPr>
-          <w:instrText xml:space="preserve"> PAGEREF _Toc243635495 \h </w:instrText>
+          <w:instrText xml:space="preserve"> PAGEREF _Toc243638028 \h </w:instrText>
         </w:r>
         <w:r>
           <w:rPr>
@@ -4444,7 +4444,7 @@
           <w14:ligatures w14:val="standardContextual"/>
         </w:rPr>
       </w:pPr>
-      <w:hyperlink w:anchor="_Toc243635496" w:history="1">
+      <w:hyperlink w:anchor="_Toc243638029" w:history="1">
         <w:r>
           <w:rPr>
             <w:rStyle w:val="Hipervnculo"/>
@@ -4471,7 +4471,7 @@
             <w:noProof/>
             <w:webHidden/>
           </w:rPr>
-          <w:instrText xml:space="preserve"> PAGEREF _Toc243635496 \h </w:instrText>
+          <w:instrText xml:space="preserve"> PAGEREF _Toc243638029 \h </w:instrText>
         </w:r>
         <w:r>
           <w:rPr>
@@ -4518,7 +4518,7 @@
           <w14:ligatures w14:val="standardContextual"/>
         </w:rPr>
       </w:pPr>
-      <w:hyperlink w:anchor="_Toc243635497" w:history="1">
+      <w:hyperlink w:anchor="_Toc243638030" w:history="1">
         <w:r>
           <w:rPr>
             <w:rStyle w:val="Hipervnculo"/>
@@ -4545,7 +4545,7 @@
             <w:noProof/>
             <w:webHidden/>
           </w:rPr>
-          <w:instrText xml:space="preserve"> PAGEREF _Toc243635497 \h </w:instrText>
+          <w:instrText xml:space="preserve"> PAGEREF _Toc243638030 \h </w:instrText>
         </w:r>
         <w:r>
           <w:rPr>
@@ -4592,7 +4592,7 @@
           <w14:ligatures w14:val="standardContextual"/>
         </w:rPr>
       </w:pPr>
-      <w:hyperlink w:anchor="_Toc243635498" w:history="1">
+      <w:hyperlink w:anchor="_Toc243638031" w:history="1">
         <w:r>
           <w:rPr>
             <w:rStyle w:val="Hipervnculo"/>
@@ -4619,7 +4619,7 @@
             <w:noProof/>
             <w:webHidden/>
           </w:rPr>
-          <w:instrText xml:space="preserve"> PAGEREF _Toc243635498 \h </w:instrText>
+          <w:instrText xml:space="preserve"> PAGEREF _Toc243638031 \h </w:instrText>
         </w:r>
         <w:r>
           <w:rPr>
@@ -4666,7 +4666,7 @@
           <w14:ligatures w14:val="standardContextual"/>
         </w:rPr>
       </w:pPr>
-      <w:hyperlink w:anchor="_Toc243635499" w:history="1">
+      <w:hyperlink w:anchor="_Toc243638032" w:history="1">
         <w:r>
           <w:rPr>
             <w:rStyle w:val="Hipervnculo"/>
@@ -4693,7 +4693,7 @@
             <w:noProof/>
             <w:webHidden/>
           </w:rPr>
-          <w:instrText xml:space="preserve"> PAGEREF _Toc243635499 \h </w:instrText>
+          <w:instrText xml:space="preserve"> PAGEREF _Toc243638032 \h </w:instrText>
         </w:r>
         <w:r>
           <w:rPr>
@@ -4740,7 +4740,7 @@
           <w14:ligatures w14:val="standardContextual"/>
         </w:rPr>
       </w:pPr>
-      <w:hyperlink w:anchor="_Toc243635500" w:history="1">
+      <w:hyperlink w:anchor="_Toc243638033" w:history="1">
         <w:r>
           <w:rPr>
             <w:rStyle w:val="Hipervnculo"/>
@@ -4767,7 +4767,7 @@
             <w:noProof/>
             <w:webHidden/>
           </w:rPr>
-          <w:instrText xml:space="preserve"> PAGEREF _Toc243635500 \h </w:instrText>
+          <w:instrText xml:space="preserve"> PAGEREF _Toc243638033 \h </w:instrText>
         </w:r>
         <w:r>
           <w:rPr>
@@ -4814,7 +4814,7 @@
           <w14:ligatures w14:val="standardContextual"/>
         </w:rPr>
       </w:pPr>
-      <w:hyperlink w:anchor="_Toc243635501" w:history="1">
+      <w:hyperlink w:anchor="_Toc243638034" w:history="1">
         <w:r>
           <w:rPr>
             <w:rStyle w:val="Hipervnculo"/>
@@ -4841,7 +4841,7 @@
             <w:noProof/>
             <w:webHidden/>
           </w:rPr>
-          <w:instrText xml:space="preserve"> PAGEREF _Toc243635501 \h </w:instrText>
+          <w:instrText xml:space="preserve"> PAGEREF _Toc243638034 \h </w:instrText>
         </w:r>
         <w:r>
           <w:rPr>
@@ -4888,7 +4888,7 @@
           <w14:ligatures w14:val="standardContextual"/>
         </w:rPr>
       </w:pPr>
-      <w:hyperlink w:anchor="_Toc243635502" w:history="1">
+      <w:hyperlink w:anchor="_Toc243638035" w:history="1">
         <w:r>
           <w:rPr>
             <w:rStyle w:val="Hipervnculo"/>
@@ -4915,7 +4915,7 @@
             <w:noProof/>
             <w:webHidden/>
           </w:rPr>
-          <w:instrText xml:space="preserve"> PAGEREF _Toc243635502 \h </w:instrText>
+          <w:instrText xml:space="preserve"> PAGEREF _Toc243638035 \h </w:instrText>
         </w:r>
         <w:r>
           <w:rPr>
@@ -4962,7 +4962,7 @@
           <w14:ligatures w14:val="standardContextual"/>
         </w:rPr>
       </w:pPr>
-      <w:hyperlink w:anchor="_Toc243635503" w:history="1">
+      <w:hyperlink w:anchor="_Toc243638036" w:history="1">
         <w:r>
           <w:rPr>
             <w:rStyle w:val="Hipervnculo"/>
@@ -4989,7 +4989,7 @@
             <w:noProof/>
             <w:webHidden/>
           </w:rPr>
-          <w:instrText xml:space="preserve"> PAGEREF _Toc243635503 \h </w:instrText>
+          <w:instrText xml:space="preserve"> PAGEREF _Toc243638036 \h </w:instrText>
         </w:r>
         <w:r>
           <w:rPr>
@@ -5036,7 +5036,7 @@
           <w14:ligatures w14:val="standardContextual"/>
         </w:rPr>
       </w:pPr>
-      <w:hyperlink w:anchor="_Toc243635504" w:history="1">
+      <w:hyperlink w:anchor="_Toc243638037" w:history="1">
         <w:r>
           <w:rPr>
             <w:rStyle w:val="Hipervnculo"/>
@@ -5063,7 +5063,7 @@
             <w:noProof/>
             <w:webHidden/>
           </w:rPr>
-          <w:instrText xml:space="preserve"> PAGEREF _Toc243635504 \h </w:instrText>
+          <w:instrText xml:space="preserve"> PAGEREF _Toc243638037 \h </w:instrText>
         </w:r>
         <w:r>
           <w:rPr>
@@ -5110,7 +5110,7 @@
           <w14:ligatures w14:val="standardContextual"/>
         </w:rPr>
       </w:pPr>
-      <w:hyperlink w:anchor="_Toc243635505" w:history="1">
+      <w:hyperlink w:anchor="_Toc243638038" w:history="1">
         <w:r>
           <w:rPr>
             <w:rStyle w:val="Hipervnculo"/>
@@ -5137,7 +5137,7 @@
             <w:noProof/>
             <w:webHidden/>
           </w:rPr>
-          <w:instrText xml:space="preserve"> PAGEREF _Toc243635505 \h </w:instrText>
+          <w:instrText xml:space="preserve"> PAGEREF _Toc243638038 \h </w:instrText>
         </w:r>
         <w:r>
           <w:rPr>
@@ -5184,7 +5184,7 @@
           <w14:ligatures w14:val="standardContextual"/>
         </w:rPr>
       </w:pPr>
-      <w:hyperlink w:anchor="_Toc243635506" w:history="1">
+      <w:hyperlink w:anchor="_Toc243638039" w:history="1">
         <w:r>
           <w:rPr>
             <w:rStyle w:val="Hipervnculo"/>
@@ -5211,7 +5211,7 @@
             <w:noProof/>
             <w:webHidden/>
           </w:rPr>
-          <w:instrText xml:space="preserve"> PAGEREF _Toc243635506 \h </w:instrText>
+          <w:instrText xml:space="preserve"> PAGEREF _Toc243638039 \h </w:instrText>
         </w:r>
         <w:r>
           <w:rPr>
@@ -5258,7 +5258,7 @@
           <w14:ligatures w14:val="standardContextual"/>
         </w:rPr>
       </w:pPr>
-      <w:hyperlink w:anchor="_Toc243635507" w:history="1">
+      <w:hyperlink w:anchor="_Toc243638040" w:history="1">
         <w:r>
           <w:rPr>
             <w:rStyle w:val="Hipervnculo"/>
@@ -5285,7 +5285,7 @@
             <w:noProof/>
             <w:webHidden/>
           </w:rPr>
-          <w:instrText xml:space="preserve"> PAGEREF _Toc243635507 \h </w:instrText>
+          <w:instrText xml:space="preserve"> PAGEREF _Toc243638040 \h </w:instrText>
         </w:r>
         <w:r>
           <w:rPr>
@@ -5332,7 +5332,7 @@
           <w14:ligatures w14:val="standardContextual"/>
         </w:rPr>
       </w:pPr>
-      <w:hyperlink w:anchor="_Toc243635508" w:history="1">
+      <w:hyperlink w:anchor="_Toc243638041" w:history="1">
         <w:r>
           <w:rPr>
             <w:rStyle w:val="Hipervnculo"/>
@@ -5359,7 +5359,7 @@
             <w:noProof/>
             <w:webHidden/>
           </w:rPr>
-          <w:instrText xml:space="preserve"> PAGEREF _Toc243635508 \h </w:instrText>
+          <w:instrText xml:space="preserve"> PAGEREF _Toc243638041 \h </w:instrText>
         </w:r>
         <w:r>
           <w:rPr>
@@ -5406,7 +5406,7 @@
           <w14:ligatures w14:val="standardContextual"/>
         </w:rPr>
       </w:pPr>
-      <w:hyperlink w:anchor="_Toc243635509" w:history="1">
+      <w:hyperlink w:anchor="_Toc243638042" w:history="1">
         <w:r>
           <w:rPr>
             <w:rStyle w:val="Hipervnculo"/>
@@ -5433,7 +5433,7 @@
             <w:noProof/>
             <w:webHidden/>
           </w:rPr>
-          <w:instrText xml:space="preserve"> PAGEREF _Toc243635509 \h </w:instrText>
+          <w:instrText xml:space="preserve"> PAGEREF _Toc243638042 \h </w:instrText>
         </w:r>
         <w:r>
           <w:rPr>
@@ -5480,7 +5480,7 @@
           <w14:ligatures w14:val="standardContextual"/>
         </w:rPr>
       </w:pPr>
-      <w:hyperlink w:anchor="_Toc243635510" w:history="1">
+      <w:hyperlink w:anchor="_Toc243638043" w:history="1">
         <w:r>
           <w:rPr>
             <w:rStyle w:val="Hipervnculo"/>
@@ -5507,7 +5507,7 @@
             <w:noProof/>
             <w:webHidden/>
           </w:rPr>
-          <w:instrText xml:space="preserve"> PAGEREF _Toc243635510 \h </w:instrText>
+          <w:instrText xml:space="preserve"> PAGEREF _Toc243638043 \h </w:instrText>
         </w:r>
         <w:r>
           <w:rPr>
@@ -5554,7 +5554,7 @@
           <w14:ligatures w14:val="standardContextual"/>
         </w:rPr>
       </w:pPr>
-      <w:hyperlink w:anchor="_Toc243635511" w:history="1">
+      <w:hyperlink w:anchor="_Toc243638044" w:history="1">
         <w:r>
           <w:rPr>
             <w:rStyle w:val="Hipervnculo"/>
@@ -5581,7 +5581,7 @@
             <w:noProof/>
             <w:webHidden/>
           </w:rPr>
-          <w:instrText xml:space="preserve"> PAGEREF _Toc243635511 \h </w:instrText>
+          <w:instrText xml:space="preserve"> PAGEREF _Toc243638044 \h </w:instrText>
         </w:r>
         <w:r>
           <w:rPr>
@@ -5628,7 +5628,7 @@
           <w14:ligatures w14:val="standardContextual"/>
         </w:rPr>
       </w:pPr>
-      <w:hyperlink w:anchor="_Toc243635512" w:history="1">
+      <w:hyperlink w:anchor="_Toc243638045" w:history="1">
         <w:r>
           <w:rPr>
             <w:rStyle w:val="Hipervnculo"/>
@@ -5655,7 +5655,7 @@
             <w:noProof/>
             <w:webHidden/>
           </w:rPr>
-          <w:instrText xml:space="preserve"> PAGEREF _Toc243635512 \h </w:instrText>
+          <w:instrText xml:space="preserve"> PAGEREF _Toc243638045 \h </w:instrText>
         </w:r>
         <w:r>
           <w:rPr>
@@ -5702,7 +5702,7 @@
           <w14:ligatures w14:val="standardContextual"/>
         </w:rPr>
       </w:pPr>
-      <w:hyperlink w:anchor="_Toc243635513" w:history="1">
+      <w:hyperlink w:anchor="_Toc243638046" w:history="1">
         <w:r>
           <w:rPr>
             <w:rStyle w:val="Hipervnculo"/>
@@ -5729,7 +5729,7 @@
             <w:noProof/>
             <w:webHidden/>
           </w:rPr>
-          <w:instrText xml:space="preserve"> PAGEREF _Toc243635513 \h </w:instrText>
+          <w:instrText xml:space="preserve"> PAGEREF _Toc243638046 \h </w:instrText>
         </w:r>
         <w:r>
           <w:rPr>
@@ -5776,7 +5776,7 @@
           <w14:ligatures w14:val="standardContextual"/>
         </w:rPr>
       </w:pPr>
-      <w:hyperlink w:anchor="_Toc243635514" w:history="1">
+      <w:hyperlink w:anchor="_Toc243638047" w:history="1">
         <w:r>
           <w:rPr>
             <w:rStyle w:val="Hipervnculo"/>
@@ -5803,7 +5803,7 @@
             <w:noProof/>
             <w:webHidden/>
           </w:rPr>
-          <w:instrText xml:space="preserve"> PAGEREF _Toc243635514 \h </w:instrText>
+          <w:instrText xml:space="preserve"> PAGEREF _Toc243638047 \h </w:instrText>
         </w:r>
         <w:r>
           <w:rPr>
@@ -5850,7 +5850,7 @@
           <w14:ligatures w14:val="standardContextual"/>
         </w:rPr>
       </w:pPr>
-      <w:hyperlink w:anchor="_Toc243635515" w:history="1">
+      <w:hyperlink w:anchor="_Toc243638048" w:history="1">
         <w:r>
           <w:rPr>
             <w:rStyle w:val="Hipervnculo"/>
@@ -5877,7 +5877,7 @@
             <w:noProof/>
             <w:webHidden/>
           </w:rPr>
-          <w:instrText xml:space="preserve"> PAGEREF _Toc243635515 \h </w:instrText>
+          <w:instrText xml:space="preserve"> PAGEREF _Toc243638048 \h </w:instrText>
         </w:r>
         <w:r>
           <w:rPr>
@@ -5924,7 +5924,7 @@
           <w14:ligatures w14:val="standardContextual"/>
         </w:rPr>
       </w:pPr>
-      <w:hyperlink w:anchor="_Toc243635516" w:history="1">
+      <w:hyperlink w:anchor="_Toc243638049" w:history="1">
         <w:r>
           <w:rPr>
             <w:rStyle w:val="Hipervnculo"/>
@@ -5951,7 +5951,7 @@
             <w:noProof/>
             <w:webHidden/>
           </w:rPr>
-          <w:instrText xml:space="preserve"> PAGEREF _Toc243635516 \h </w:instrText>
+          <w:instrText xml:space="preserve"> PAGEREF _Toc243638049 \h </w:instrText>
         </w:r>
         <w:r>
           <w:rPr>
@@ -5998,7 +5998,7 @@
           <w14:ligatures w14:val="standardContextual"/>
         </w:rPr>
       </w:pPr>
-      <w:hyperlink w:anchor="_Toc243635517" w:history="1">
+      <w:hyperlink w:anchor="_Toc243638050" w:history="1">
         <w:r>
           <w:rPr>
             <w:rStyle w:val="Hipervnculo"/>
@@ -6025,7 +6025,7 @@
             <w:noProof/>
             <w:webHidden/>
           </w:rPr>
-          <w:instrText xml:space="preserve"> PAGEREF _Toc243635517 \h </w:instrText>
+          <w:instrText xml:space="preserve"> PAGEREF _Toc243638050 \h </w:instrText>
         </w:r>
         <w:r>
           <w:rPr>
@@ -6072,7 +6072,7 @@
           <w14:ligatures w14:val="standardContextual"/>
         </w:rPr>
       </w:pPr>
-      <w:hyperlink w:anchor="_Toc243635518" w:history="1">
+      <w:hyperlink w:anchor="_Toc243638051" w:history="1">
         <w:r>
           <w:rPr>
             <w:rStyle w:val="Hipervnculo"/>
@@ -6099,7 +6099,7 @@
             <w:noProof/>
             <w:webHidden/>
           </w:rPr>
-          <w:instrText xml:space="preserve"> PAGEREF _Toc243635518 \h </w:instrText>
+          <w:instrText xml:space="preserve"> PAGEREF _Toc243638051 \h </w:instrText>
         </w:r>
         <w:r>
           <w:rPr>
@@ -6146,7 +6146,7 @@
           <w14:ligatures w14:val="standardContextual"/>
         </w:rPr>
       </w:pPr>
-      <w:hyperlink w:anchor="_Toc243635519" w:history="1">
+      <w:hyperlink w:anchor="_Toc243638052" w:history="1">
         <w:r>
           <w:rPr>
             <w:rStyle w:val="Hipervnculo"/>
@@ -6173,7 +6173,7 @@
             <w:noProof/>
             <w:webHidden/>
           </w:rPr>
-          <w:instrText xml:space="preserve"> PAGEREF _Toc243635519 \h </w:instrText>
+          <w:instrText xml:space="preserve"> PAGEREF _Toc243638052 \h </w:instrText>
         </w:r>
         <w:r>
           <w:rPr>
@@ -6220,7 +6220,7 @@
           <w14:ligatures w14:val="standardContextual"/>
         </w:rPr>
       </w:pPr>
-      <w:hyperlink w:anchor="_Toc243635520" w:history="1">
+      <w:hyperlink w:anchor="_Toc243638053" w:history="1">
         <w:r>
           <w:rPr>
             <w:rStyle w:val="Hipervnculo"/>
@@ -6247,7 +6247,7 @@
             <w:noProof/>
             <w:webHidden/>
           </w:rPr>
-          <w:instrText xml:space="preserve"> PAGEREF _Toc243635520 \h </w:instrText>
+          <w:instrText xml:space="preserve"> PAGEREF _Toc243638053 \h </w:instrText>
         </w:r>
         <w:r>
           <w:rPr>
@@ -6294,7 +6294,7 @@
           <w14:ligatures w14:val="standardContextual"/>
         </w:rPr>
       </w:pPr>
-      <w:hyperlink w:anchor="_Toc243635521" w:history="1">
+      <w:hyperlink w:anchor="_Toc243638054" w:history="1">
         <w:r>
           <w:rPr>
             <w:rStyle w:val="Hipervnculo"/>
@@ -6321,7 +6321,7 @@
             <w:noProof/>
             <w:webHidden/>
           </w:rPr>
-          <w:instrText xml:space="preserve"> PAGEREF _Toc243635521 \h </w:instrText>
+          <w:instrText xml:space="preserve"> PAGEREF _Toc243638054 \h </w:instrText>
         </w:r>
         <w:r>
           <w:rPr>
@@ -6368,7 +6368,7 @@
           <w14:ligatures w14:val="standardContextual"/>
         </w:rPr>
       </w:pPr>
-      <w:hyperlink w:anchor="_Toc243635522" w:history="1">
+      <w:hyperlink w:anchor="_Toc243638055" w:history="1">
         <w:r>
           <w:rPr>
             <w:rStyle w:val="Hipervnculo"/>
@@ -6395,7 +6395,7 @@
             <w:noProof/>
             <w:webHidden/>
           </w:rPr>
-          <w:instrText xml:space="preserve"> PAGEREF _Toc243635522 \h </w:instrText>
+          <w:instrText xml:space="preserve"> PAGEREF _Toc243638055 \h </w:instrText>
         </w:r>
         <w:r>
           <w:rPr>
@@ -6442,7 +6442,7 @@
           <w14:ligatures w14:val="standardContextual"/>
         </w:rPr>
       </w:pPr>
-      <w:hyperlink w:anchor="_Toc243635523" w:history="1">
+      <w:hyperlink w:anchor="_Toc243638056" w:history="1">
         <w:r>
           <w:rPr>
             <w:rStyle w:val="Hipervnculo"/>
@@ -6469,7 +6469,7 @@
             <w:noProof/>
             <w:webHidden/>
           </w:rPr>
-          <w:instrText xml:space="preserve"> PAGEREF _Toc243635523 \h </w:instrText>
+          <w:instrText xml:space="preserve"> PAGEREF _Toc243638056 \h </w:instrText>
         </w:r>
         <w:r>
           <w:rPr>
@@ -6516,7 +6516,7 @@
           <w14:ligatures w14:val="standardContextual"/>
         </w:rPr>
       </w:pPr>
-      <w:hyperlink w:anchor="_Toc243635524" w:history="1">
+      <w:hyperlink w:anchor="_Toc243638057" w:history="1">
         <w:r>
           <w:rPr>
             <w:rStyle w:val="Hipervnculo"/>
@@ -6543,7 +6543,7 @@
             <w:noProof/>
             <w:webHidden/>
           </w:rPr>
-          <w:instrText xml:space="preserve"> PAGEREF _Toc243635524 \h </w:instrText>
+          <w:instrText xml:space="preserve"> PAGEREF _Toc243638057 \h </w:instrText>
         </w:r>
         <w:r>
           <w:rPr>
@@ -6590,7 +6590,7 @@
           <w14:ligatures w14:val="standardContextual"/>
         </w:rPr>
       </w:pPr>
-      <w:hyperlink w:anchor="_Toc243635525" w:history="1">
+      <w:hyperlink w:anchor="_Toc243638058" w:history="1">
         <w:r>
           <w:rPr>
             <w:rStyle w:val="Hipervnculo"/>
@@ -6617,7 +6617,7 @@
             <w:noProof/>
             <w:webHidden/>
           </w:rPr>
-          <w:instrText xml:space="preserve"> PAGEREF _Toc243635525 \h </w:instrText>
+          <w:instrText xml:space="preserve"> PAGEREF _Toc243638058 \h </w:instrText>
         </w:r>
         <w:r>
           <w:rPr>
@@ -6664,7 +6664,7 @@
           <w14:ligatures w14:val="standardContextual"/>
         </w:rPr>
       </w:pPr>
-      <w:hyperlink w:anchor="_Toc243635526" w:history="1">
+      <w:hyperlink w:anchor="_Toc243638059" w:history="1">
         <w:r>
           <w:rPr>
             <w:rStyle w:val="Hipervnculo"/>
@@ -6691,7 +6691,7 @@
             <w:noProof/>
             <w:webHidden/>
           </w:rPr>
-          <w:instrText xml:space="preserve"> PAGEREF _Toc243635526 \h </w:instrText>
+          <w:instrText xml:space="preserve"> PAGEREF _Toc243638059 \h </w:instrText>
         </w:r>
         <w:r>
           <w:rPr>
@@ -6711,7 +6711,7 @@
             <w:noProof/>
             <w:webHidden/>
           </w:rPr>
-          <w:t>78</w:t>
+          <w:t>79</w:t>
         </w:r>
         <w:r>
           <w:rPr>
@@ -6738,7 +6738,7 @@
           <w14:ligatures w14:val="standardContextual"/>
         </w:rPr>
       </w:pPr>
-      <w:hyperlink w:anchor="_Toc243635527" w:history="1">
+      <w:hyperlink w:anchor="_Toc243638060" w:history="1">
         <w:r>
           <w:rPr>
             <w:rStyle w:val="Hipervnculo"/>
@@ -6765,7 +6765,7 @@
             <w:noProof/>
             <w:webHidden/>
           </w:rPr>
-          <w:instrText xml:space="preserve"> PAGEREF _Toc243635527 \h </w:instrText>
+          <w:instrText xml:space="preserve"> PAGEREF _Toc243638060 \h </w:instrText>
         </w:r>
         <w:r>
           <w:rPr>
@@ -6812,7 +6812,7 @@
           <w14:ligatures w14:val="standardContextual"/>
         </w:rPr>
       </w:pPr>
-      <w:hyperlink w:anchor="_Toc243635528" w:history="1">
+      <w:hyperlink w:anchor="_Toc243638061" w:history="1">
         <w:r>
           <w:rPr>
             <w:rStyle w:val="Hipervnculo"/>
@@ -6839,7 +6839,7 @@
             <w:noProof/>
             <w:webHidden/>
           </w:rPr>
-          <w:instrText xml:space="preserve"> PAGEREF _Toc243635528 \h </w:instrText>
+          <w:instrText xml:space="preserve"> PAGEREF _Toc243638061 \h </w:instrText>
         </w:r>
         <w:r>
           <w:rPr>
@@ -6886,7 +6886,7 @@
           <w14:ligatures w14:val="standardContextual"/>
         </w:rPr>
       </w:pPr>
-      <w:hyperlink w:anchor="_Toc243635529" w:history="1">
+      <w:hyperlink w:anchor="_Toc243638062" w:history="1">
         <w:r>
           <w:rPr>
             <w:rStyle w:val="Hipervnculo"/>
@@ -6913,7 +6913,7 @@
             <w:noProof/>
             <w:webHidden/>
           </w:rPr>
-          <w:instrText xml:space="preserve"> PAGEREF _Toc243635529 \h </w:instrText>
+          <w:instrText xml:space="preserve"> PAGEREF _Toc243638062 \h </w:instrText>
         </w:r>
         <w:r>
           <w:rPr>
@@ -6960,7 +6960,7 @@
           <w14:ligatures w14:val="standardContextual"/>
         </w:rPr>
       </w:pPr>
-      <w:hyperlink w:anchor="_Toc243635530" w:history="1">
+      <w:hyperlink w:anchor="_Toc243638063" w:history="1">
         <w:r>
           <w:rPr>
             <w:rStyle w:val="Hipervnculo"/>
@@ -6987,7 +6987,7 @@
             <w:noProof/>
             <w:webHidden/>
           </w:rPr>
-          <w:instrText xml:space="preserve"> PAGEREF _Toc243635530 \h </w:instrText>
+          <w:instrText xml:space="preserve"> PAGEREF _Toc243638063 \h </w:instrText>
         </w:r>
         <w:r>
           <w:rPr>
@@ -7034,7 +7034,7 @@
           <w14:ligatures w14:val="standardContextual"/>
         </w:rPr>
       </w:pPr>
-      <w:hyperlink w:anchor="_Toc243635531" w:history="1">
+      <w:hyperlink w:anchor="_Toc243638064" w:history="1">
         <w:r>
           <w:rPr>
             <w:rStyle w:val="Hipervnculo"/>
@@ -7061,7 +7061,7 @@
             <w:noProof/>
             <w:webHidden/>
           </w:rPr>
-          <w:instrText xml:space="preserve"> PAGEREF _Toc243635531 \h </w:instrText>
+          <w:instrText xml:space="preserve"> PAGEREF _Toc243638064 \h </w:instrText>
         </w:r>
         <w:r>
           <w:rPr>
@@ -7081,7 +7081,7 @@
             <w:noProof/>
             <w:webHidden/>
           </w:rPr>
-          <w:t>81</w:t>
+          <w:t>82</w:t>
         </w:r>
         <w:r>
           <w:rPr>
@@ -7108,7 +7108,7 @@
           <w14:ligatures w14:val="standardContextual"/>
         </w:rPr>
       </w:pPr>
-      <w:hyperlink w:anchor="_Toc243635532" w:history="1">
+      <w:hyperlink w:anchor="_Toc243638065" w:history="1">
         <w:r>
           <w:rPr>
             <w:rStyle w:val="Hipervnculo"/>
@@ -7135,7 +7135,7 @@
             <w:noProof/>
             <w:webHidden/>
           </w:rPr>
-          <w:instrText xml:space="preserve"> PAGEREF _Toc243635532 \h </w:instrText>
+          <w:instrText xml:space="preserve"> PAGEREF _Toc243638065 \h </w:instrText>
         </w:r>
         <w:r>
           <w:rPr>
@@ -7155,7 +7155,7 @@
             <w:noProof/>
             <w:webHidden/>
           </w:rPr>
-          <w:t>84</w:t>
+          <w:t>85</w:t>
         </w:r>
         <w:r>
           <w:rPr>
@@ -7182,7 +7182,7 @@
           <w14:ligatures w14:val="standardContextual"/>
         </w:rPr>
       </w:pPr>
-      <w:hyperlink w:anchor="_Toc243635533" w:history="1">
+      <w:hyperlink w:anchor="_Toc243638066" w:history="1">
         <w:r>
           <w:rPr>
             <w:rStyle w:val="Hipervnculo"/>
@@ -7209,7 +7209,7 @@
             <w:noProof/>
             <w:webHidden/>
           </w:rPr>
-          <w:instrText xml:space="preserve"> PAGEREF _Toc243635533 \h </w:instrText>
+          <w:instrText xml:space="preserve"> PAGEREF _Toc243638066 \h </w:instrText>
         </w:r>
         <w:r>
           <w:rPr>
@@ -7229,7 +7229,7 @@
             <w:noProof/>
             <w:webHidden/>
           </w:rPr>
-          <w:t>84</w:t>
+          <w:t>85</w:t>
         </w:r>
         <w:r>
           <w:rPr>
@@ -7256,7 +7256,7 @@
           <w14:ligatures w14:val="standardContextual"/>
         </w:rPr>
       </w:pPr>
-      <w:hyperlink w:anchor="_Toc243635534" w:history="1">
+      <w:hyperlink w:anchor="_Toc243638067" w:history="1">
         <w:r>
           <w:rPr>
             <w:rStyle w:val="Hipervnculo"/>
@@ -7283,7 +7283,7 @@
             <w:noProof/>
             <w:webHidden/>
           </w:rPr>
-          <w:instrText xml:space="preserve"> PAGEREF _Toc243635534 \h </w:instrText>
+          <w:instrText xml:space="preserve"> PAGEREF _Toc243638067 \h </w:instrText>
         </w:r>
         <w:r>
           <w:rPr>
@@ -7303,7 +7303,7 @@
             <w:noProof/>
             <w:webHidden/>
           </w:rPr>
-          <w:t>84</w:t>
+          <w:t>85</w:t>
         </w:r>
         <w:r>
           <w:rPr>
@@ -7846,7 +7846,7 @@
       <w:r>
         <w:br w:type="page"/>
       </w:r>
-      <w:bookmarkStart w:id="1" w:name="_Toc243635441"/>
+      <w:bookmarkStart w:id="1" w:name="_Toc243637974"/>
       <w:r>
         <w:lastRenderedPageBreak/>
         <w:t>1. Introducción y objetivos</w:t>
@@ -7857,7 +7857,7 @@
       <w:pPr>
         <w:pStyle w:val="Ttulo2"/>
       </w:pPr>
-      <w:bookmarkStart w:id="2" w:name="_Toc243635442"/>
+      <w:bookmarkStart w:id="2" w:name="_Toc243637975"/>
       <w:r>
         <w:t>1.1. Contexto, motivación y justificación</w:t>
       </w:r>
@@ -7920,7 +7920,7 @@
       <w:pPr>
         <w:pStyle w:val="Ttulo2"/>
       </w:pPr>
-      <w:bookmarkStart w:id="3" w:name="_Toc243635443"/>
+      <w:bookmarkStart w:id="3" w:name="_Toc243637976"/>
       <w:r>
         <w:t>1.2. Objetivos generales y específicos</w:t>
       </w:r>
@@ -7982,7 +7982,7 @@
       <w:pPr>
         <w:pStyle w:val="Ttulo2"/>
       </w:pPr>
-      <w:bookmarkStart w:id="4" w:name="_Toc243635444"/>
+      <w:bookmarkStart w:id="4" w:name="_Toc243637977"/>
       <w:r>
         <w:t>1.3. Alcance, usuarios y limitaciones</w:t>
       </w:r>
@@ -8037,7 +8037,7 @@
         <w:pStyle w:val="Ttulo1"/>
         <w:pageBreakBefore/>
       </w:pPr>
-      <w:bookmarkStart w:id="5" w:name="_Toc243635445"/>
+      <w:bookmarkStart w:id="5" w:name="_Toc243637978"/>
       <w:r>
         <w:lastRenderedPageBreak/>
         <w:t>2. Marco teórico y estado del arte</w:t>
@@ -8048,7 +8048,7 @@
       <w:pPr>
         <w:pStyle w:val="Ttulo2"/>
       </w:pPr>
-      <w:bookmarkStart w:id="6" w:name="_Toc243635446"/>
+      <w:bookmarkStart w:id="6" w:name="_Toc243637979"/>
       <w:r>
         <w:t>2.1. Necesidades hídricas y gestión eficiente del riego</w:t>
       </w:r>
@@ -8119,7 +8119,7 @@
       <w:pPr>
         <w:pStyle w:val="Ttulo2"/>
       </w:pPr>
-      <w:bookmarkStart w:id="7" w:name="_Toc243635447"/>
+      <w:bookmarkStart w:id="7" w:name="_Toc243637980"/>
       <w:r>
         <w:t>2.2. Agricultura de precisión y Machine Learning</w:t>
       </w:r>
@@ -8184,7 +8184,7 @@
       <w:pPr>
         <w:pStyle w:val="Ttulo2"/>
       </w:pPr>
-      <w:bookmarkStart w:id="8" w:name="_Toc243635448"/>
+      <w:bookmarkStart w:id="8" w:name="_Toc243637981"/>
       <w:r>
         <w:t>2.3. Sistemas inteligentes de apoyo a la decisión</w:t>
       </w:r>
@@ -8248,7 +8248,7 @@
         <w:pStyle w:val="Ttulo1"/>
         <w:pageBreakBefore/>
       </w:pPr>
-      <w:bookmarkStart w:id="9" w:name="_Toc243635449"/>
+      <w:bookmarkStart w:id="9" w:name="_Toc243637982"/>
       <w:r>
         <w:lastRenderedPageBreak/>
         <w:t>3. Metodología y arquitectura del sistema</w:t>
@@ -8259,7 +8259,7 @@
       <w:pPr>
         <w:pStyle w:val="Ttulo2"/>
       </w:pPr>
-      <w:bookmarkStart w:id="10" w:name="_Toc243635450"/>
+      <w:bookmarkStart w:id="10" w:name="_Toc243637983"/>
       <w:r>
         <w:t>3.1. Fuentes, variables y calidad de los datos</w:t>
       </w:r>
@@ -8279,7 +8279,7 @@
       <w:pPr>
         <w:pStyle w:val="Ttulo3"/>
       </w:pPr>
-      <w:bookmarkStart w:id="11" w:name="_Toc243635451"/>
+      <w:bookmarkStart w:id="11" w:name="_Toc243637984"/>
       <w:r>
         <w:rPr>
           <w:sz w:val="24"/>
@@ -8949,7 +8949,7 @@
       <w:pPr>
         <w:pStyle w:val="Ttulo3"/>
       </w:pPr>
-      <w:bookmarkStart w:id="12" w:name="_Toc243635452"/>
+      <w:bookmarkStart w:id="12" w:name="_Toc243637985"/>
       <w:r>
         <w:rPr>
           <w:sz w:val="24"/>
@@ -9690,7 +9690,7 @@
       <w:pPr>
         <w:pStyle w:val="Ttulo3"/>
       </w:pPr>
-      <w:bookmarkStart w:id="13" w:name="_Toc243635453"/>
+      <w:bookmarkStart w:id="13" w:name="_Toc243637986"/>
       <w:r>
         <w:rPr>
           <w:sz w:val="24"/>
@@ -9799,7 +9799,7 @@
       <w:pPr>
         <w:pStyle w:val="Ttulo3"/>
       </w:pPr>
-      <w:bookmarkStart w:id="14" w:name="_Toc243635454"/>
+      <w:bookmarkStart w:id="14" w:name="_Toc243637987"/>
       <w:r>
         <w:rPr>
           <w:sz w:val="24"/>
@@ -9823,7 +9823,7 @@
       <w:pPr>
         <w:pStyle w:val="Ttulo2"/>
       </w:pPr>
-      <w:bookmarkStart w:id="15" w:name="_Toc243635455"/>
+      <w:bookmarkStart w:id="15" w:name="_Toc243637988"/>
       <w:r>
         <w:t>3.2. Arquitectura, tecnologías y flujo de información</w:t>
       </w:r>
@@ -9843,7 +9843,7 @@
           <w:noProof/>
         </w:rPr>
         <w:drawing>
-          <wp:inline distT="0" distB="0" distL="0" distR="0" wp14:anchorId="705E317F" wp14:editId="689DD70F">
+          <wp:inline distT="0" distB="0" distL="0" distR="0" wp14:anchorId="3D43793B" wp14:editId="608EAFA3">
             <wp:extent cx="5577840" cy="3353664"/>
             <wp:effectExtent l="0" t="0" r="0" b="0"/>
             <wp:docPr id="30" name="Picture 30"/>
@@ -9896,7 +9896,7 @@
       <w:pPr>
         <w:pStyle w:val="Ttulo3"/>
       </w:pPr>
-      <w:bookmarkStart w:id="16" w:name="_Toc243635456"/>
+      <w:bookmarkStart w:id="16" w:name="_Toc243637989"/>
       <w:r>
         <w:rPr>
           <w:sz w:val="24"/>
@@ -10042,7 +10042,7 @@
       <w:pPr>
         <w:pStyle w:val="Ttulo3"/>
       </w:pPr>
-      <w:bookmarkStart w:id="17" w:name="_Toc243635457"/>
+      <w:bookmarkStart w:id="17" w:name="_Toc243637990"/>
       <w:r>
         <w:rPr>
           <w:sz w:val="24"/>
@@ -11050,7 +11050,7 @@
       <w:pPr>
         <w:pStyle w:val="Ttulo3"/>
       </w:pPr>
-      <w:bookmarkStart w:id="18" w:name="_Toc243635458"/>
+      <w:bookmarkStart w:id="18" w:name="_Toc243637991"/>
       <w:r>
         <w:rPr>
           <w:sz w:val="24"/>
@@ -11077,7 +11077,7 @@
       <w:pPr>
         <w:pStyle w:val="Ttulo3"/>
       </w:pPr>
-      <w:bookmarkStart w:id="19" w:name="_Toc243635459"/>
+      <w:bookmarkStart w:id="19" w:name="_Toc243637992"/>
       <w:r>
         <w:rPr>
           <w:sz w:val="24"/>
@@ -11100,7 +11100,7 @@
       <w:pPr>
         <w:pStyle w:val="Ttulo2"/>
       </w:pPr>
-      <w:bookmarkStart w:id="20" w:name="_Toc243635460"/>
+      <w:bookmarkStart w:id="20" w:name="_Toc243637993"/>
       <w:r>
         <w:t>3.3. Planificación y organización del proyecto</w:t>
       </w:r>
@@ -11747,7 +11747,7 @@
         <w:pStyle w:val="Ttulo1"/>
         <w:pageBreakBefore/>
       </w:pPr>
-      <w:bookmarkStart w:id="21" w:name="_Toc243635461"/>
+      <w:bookmarkStart w:id="21" w:name="_Toc243637994"/>
       <w:r>
         <w:lastRenderedPageBreak/>
         <w:t>4. Procesamiento de datos y Machine Learning</w:t>
@@ -11758,7 +11758,7 @@
       <w:pPr>
         <w:pStyle w:val="Ttulo2"/>
       </w:pPr>
-      <w:bookmarkStart w:id="22" w:name="_Toc243635462"/>
+      <w:bookmarkStart w:id="22" w:name="_Toc243637995"/>
       <w:r>
         <w:t>4.1. Extracción, transformación y almacenamiento de datos</w:t>
       </w:r>
@@ -11786,7 +11786,7 @@
           <w:noProof/>
         </w:rPr>
         <w:drawing>
-          <wp:inline distT="0" distB="0" distL="0" distR="0" wp14:anchorId="0A505975" wp14:editId="47848C69">
+          <wp:inline distT="0" distB="0" distL="0" distR="0" wp14:anchorId="5CF4ECEF" wp14:editId="3B327C2B">
             <wp:extent cx="5577840" cy="3236939"/>
             <wp:effectExtent l="0" t="0" r="0" b="0"/>
             <wp:docPr id="31" name="Picture 31"/>
@@ -11839,7 +11839,7 @@
       <w:pPr>
         <w:pStyle w:val="Ttulo3"/>
       </w:pPr>
-      <w:bookmarkStart w:id="23" w:name="_Toc243635463"/>
+      <w:bookmarkStart w:id="23" w:name="_Toc243637996"/>
       <w:r>
         <w:rPr>
           <w:sz w:val="24"/>
@@ -12426,7 +12426,7 @@
       <w:pPr>
         <w:pStyle w:val="Ttulo3"/>
       </w:pPr>
-      <w:bookmarkStart w:id="24" w:name="_Toc243635464"/>
+      <w:bookmarkStart w:id="24" w:name="_Toc243637997"/>
       <w:r>
         <w:rPr>
           <w:sz w:val="24"/>
@@ -12894,7 +12894,7 @@
       <w:pPr>
         <w:pStyle w:val="Ttulo3"/>
       </w:pPr>
-      <w:bookmarkStart w:id="25" w:name="_Toc243635465"/>
+      <w:bookmarkStart w:id="25" w:name="_Toc243637998"/>
       <w:r>
         <w:rPr>
           <w:sz w:val="24"/>
@@ -13678,7 +13678,7 @@
       <w:pPr>
         <w:pStyle w:val="Ttulo3"/>
       </w:pPr>
-      <w:bookmarkStart w:id="26" w:name="_Toc243635466"/>
+      <w:bookmarkStart w:id="26" w:name="_Toc243637999"/>
       <w:r>
         <w:rPr>
           <w:sz w:val="24"/>
@@ -13752,7 +13752,7 @@
       <w:pPr>
         <w:pStyle w:val="Ttulo3"/>
       </w:pPr>
-      <w:bookmarkStart w:id="27" w:name="_Toc243635467"/>
+      <w:bookmarkStart w:id="27" w:name="_Toc243638000"/>
       <w:r>
         <w:rPr>
           <w:sz w:val="24"/>
@@ -13901,7 +13901,7 @@
       <w:pPr>
         <w:pStyle w:val="Ttulo3"/>
       </w:pPr>
-      <w:bookmarkStart w:id="28" w:name="_Toc243635468"/>
+      <w:bookmarkStart w:id="28" w:name="_Toc243638001"/>
       <w:r>
         <w:rPr>
           <w:sz w:val="24"/>
@@ -16512,7 +16512,7 @@
       <w:pPr>
         <w:pStyle w:val="Ttulo3"/>
       </w:pPr>
-      <w:bookmarkStart w:id="29" w:name="_Toc243635469"/>
+      <w:bookmarkStart w:id="29" w:name="_Toc243638002"/>
       <w:r>
         <w:rPr>
           <w:sz w:val="24"/>
@@ -18501,7 +18501,7 @@
       <w:pPr>
         <w:pStyle w:val="Ttulo3"/>
       </w:pPr>
-      <w:bookmarkStart w:id="30" w:name="_Toc243635470"/>
+      <w:bookmarkStart w:id="30" w:name="_Toc243638003"/>
       <w:r>
         <w:rPr>
           <w:sz w:val="24"/>
@@ -19253,7 +19253,7 @@
       <w:pPr>
         <w:pStyle w:val="Ttulo3"/>
       </w:pPr>
-      <w:bookmarkStart w:id="31" w:name="_Toc243635471"/>
+      <w:bookmarkStart w:id="31" w:name="_Toc243638004"/>
       <w:r>
         <w:rPr>
           <w:sz w:val="24"/>
@@ -19280,7 +19280,7 @@
       <w:pPr>
         <w:pStyle w:val="Ttulo3"/>
       </w:pPr>
-      <w:bookmarkStart w:id="32" w:name="_Toc243635472"/>
+      <w:bookmarkStart w:id="32" w:name="_Toc243638005"/>
       <w:r>
         <w:rPr>
           <w:sz w:val="24"/>
@@ -19334,7 +19334,7 @@
       <w:pPr>
         <w:pStyle w:val="Ttulo3"/>
       </w:pPr>
-      <w:bookmarkStart w:id="33" w:name="_Toc243635473"/>
+      <w:bookmarkStart w:id="33" w:name="_Toc243638006"/>
       <w:r>
         <w:rPr>
           <w:sz w:val="24"/>
@@ -19352,7 +19352,7 @@
       <w:pPr>
         <w:pStyle w:val="Ttulo2"/>
       </w:pPr>
-      <w:bookmarkStart w:id="34" w:name="_Toc243635474"/>
+      <w:bookmarkStart w:id="34" w:name="_Toc243638007"/>
       <w:r>
         <w:t>4.2. Análisis exploratorio y preparación de variables</w:t>
       </w:r>
@@ -19367,7 +19367,7 @@
       <w:pPr>
         <w:pStyle w:val="Ttulo3"/>
       </w:pPr>
-      <w:bookmarkStart w:id="35" w:name="_Toc243635475"/>
+      <w:bookmarkStart w:id="35" w:name="_Toc243638008"/>
       <w:r>
         <w:rPr>
           <w:sz w:val="24"/>
@@ -19897,7 +19897,7 @@
       <w:pPr>
         <w:pStyle w:val="Ttulo3"/>
       </w:pPr>
-      <w:bookmarkStart w:id="36" w:name="_Toc243635476"/>
+      <w:bookmarkStart w:id="36" w:name="_Toc243638009"/>
       <w:r>
         <w:rPr>
           <w:sz w:val="24"/>
@@ -20963,7 +20963,7 @@
       <w:pPr>
         <w:pStyle w:val="Ttulo3"/>
       </w:pPr>
-      <w:bookmarkStart w:id="37" w:name="_Toc243635477"/>
+      <w:bookmarkStart w:id="37" w:name="_Toc243638010"/>
       <w:r>
         <w:rPr>
           <w:sz w:val="24"/>
@@ -21050,7 +21050,7 @@
       <w:pPr>
         <w:pStyle w:val="Ttulo3"/>
       </w:pPr>
-      <w:bookmarkStart w:id="38" w:name="_Toc243635478"/>
+      <w:bookmarkStart w:id="38" w:name="_Toc243638011"/>
       <w:r>
         <w:rPr>
           <w:sz w:val="24"/>
@@ -21133,7 +21133,7 @@
       <w:pPr>
         <w:pStyle w:val="Ttulo3"/>
       </w:pPr>
-      <w:bookmarkStart w:id="39" w:name="_Toc243635479"/>
+      <w:bookmarkStart w:id="39" w:name="_Toc243638012"/>
       <w:r>
         <w:rPr>
           <w:sz w:val="24"/>
@@ -21671,7 +21671,7 @@
       <w:pPr>
         <w:pStyle w:val="Ttulo3"/>
       </w:pPr>
-      <w:bookmarkStart w:id="40" w:name="_Toc243635480"/>
+      <w:bookmarkStart w:id="40" w:name="_Toc243638013"/>
       <w:r>
         <w:rPr>
           <w:sz w:val="24"/>
@@ -21699,7 +21699,7 @@
       <w:pPr>
         <w:pStyle w:val="Ttulo3"/>
       </w:pPr>
-      <w:bookmarkStart w:id="41" w:name="_Toc243635481"/>
+      <w:bookmarkStart w:id="41" w:name="_Toc243638014"/>
       <w:r>
         <w:rPr>
           <w:sz w:val="24"/>
@@ -21815,7 +21815,7 @@
       <w:pPr>
         <w:pStyle w:val="Ttulo2"/>
       </w:pPr>
-      <w:bookmarkStart w:id="42" w:name="_Toc243635482"/>
+      <w:bookmarkStart w:id="42" w:name="_Toc243638015"/>
       <w:r>
         <w:lastRenderedPageBreak/>
         <w:t>4.3. Desarrollo y evaluación del modelo predictivo</w:t>
@@ -21831,7 +21831,7 @@
       <w:pPr>
         <w:pStyle w:val="Ttulo3"/>
       </w:pPr>
-      <w:bookmarkStart w:id="43" w:name="_Toc243635483"/>
+      <w:bookmarkStart w:id="43" w:name="_Toc243638016"/>
       <w:r>
         <w:rPr>
           <w:sz w:val="24"/>
@@ -21859,7 +21859,7 @@
       <w:pPr>
         <w:pStyle w:val="Ttulo3"/>
       </w:pPr>
-      <w:bookmarkStart w:id="44" w:name="_Toc243635484"/>
+      <w:bookmarkStart w:id="44" w:name="_Toc243638017"/>
       <w:r>
         <w:rPr>
           <w:sz w:val="24"/>
@@ -21885,7 +21885,7 @@
       <w:pPr>
         <w:pStyle w:val="Ttulo3"/>
       </w:pPr>
-      <w:bookmarkStart w:id="45" w:name="_Toc243635485"/>
+      <w:bookmarkStart w:id="45" w:name="_Toc243638018"/>
       <w:r>
         <w:rPr>
           <w:sz w:val="24"/>
@@ -22026,7 +22026,7 @@
       <w:pPr>
         <w:pStyle w:val="Ttulo3"/>
       </w:pPr>
-      <w:bookmarkStart w:id="46" w:name="_Toc243635486"/>
+      <w:bookmarkStart w:id="46" w:name="_Toc243638019"/>
       <w:r>
         <w:rPr>
           <w:sz w:val="24"/>
@@ -22044,7 +22044,7 @@
       <w:pPr>
         <w:pStyle w:val="Ttulo3"/>
       </w:pPr>
-      <w:bookmarkStart w:id="47" w:name="_Toc243635487"/>
+      <w:bookmarkStart w:id="47" w:name="_Toc243638020"/>
       <w:r>
         <w:rPr>
           <w:sz w:val="24"/>
@@ -23018,7 +23018,7 @@
       <w:pPr>
         <w:pStyle w:val="Ttulo3"/>
       </w:pPr>
-      <w:bookmarkStart w:id="48" w:name="_Toc243635488"/>
+      <w:bookmarkStart w:id="48" w:name="_Toc243638021"/>
       <w:r>
         <w:rPr>
           <w:sz w:val="24"/>
@@ -24098,7 +24098,7 @@
         </w:rPr>
         <w:lastRenderedPageBreak/>
         <w:drawing>
-          <wp:inline distT="0" distB="0" distL="0" distR="0" wp14:anchorId="430B66BF" wp14:editId="2771759F">
+          <wp:inline distT="0" distB="0" distL="0" distR="0" wp14:anchorId="1AD25451" wp14:editId="11F960F9">
             <wp:extent cx="5212080" cy="3571970"/>
             <wp:effectExtent l="0" t="0" r="0" b="0"/>
             <wp:docPr id="32" name="Picture 32"/>
@@ -24152,7 +24152,7 @@
       <w:pPr>
         <w:pStyle w:val="Ttulo3"/>
       </w:pPr>
-      <w:bookmarkStart w:id="49" w:name="_Toc243635489"/>
+      <w:bookmarkStart w:id="49" w:name="_Toc243638022"/>
       <w:r>
         <w:rPr>
           <w:sz w:val="24"/>
@@ -24180,7 +24180,7 @@
       <w:pPr>
         <w:pStyle w:val="Ttulo3"/>
       </w:pPr>
-      <w:bookmarkStart w:id="50" w:name="_Toc243635490"/>
+      <w:bookmarkStart w:id="50" w:name="_Toc243638023"/>
       <w:r>
         <w:rPr>
           <w:sz w:val="24"/>
@@ -24204,7 +24204,7 @@
       <w:pPr>
         <w:pStyle w:val="Ttulo3"/>
       </w:pPr>
-      <w:bookmarkStart w:id="51" w:name="_Toc243635491"/>
+      <w:bookmarkStart w:id="51" w:name="_Toc243638024"/>
       <w:r>
         <w:rPr>
           <w:sz w:val="24"/>
@@ -24239,7 +24239,7 @@
         <w:pageBreakBefore/>
       </w:pPr>
       <w:bookmarkStart w:id="52" w:name="_Toc243495226"/>
-      <w:bookmarkStart w:id="53" w:name="_Toc243635492"/>
+      <w:bookmarkStart w:id="53" w:name="_Toc243638025"/>
       <w:r>
         <w:lastRenderedPageBreak/>
         <w:t>5. Sistema de recomendación y resultados</w:t>
@@ -24251,7 +24251,7 @@
       <w:pPr>
         <w:pStyle w:val="Ttulo2"/>
       </w:pPr>
-      <w:bookmarkStart w:id="54" w:name="_Toc243635493"/>
+      <w:bookmarkStart w:id="54" w:name="_Toc243638026"/>
       <w:r>
         <w:t>5.1. Diseño del sistema de recomendación de riego</w:t>
       </w:r>
@@ -24264,14 +24264,14 @@
     </w:p>
     <w:p>
       <w:r>
-        <w:t>El sistema se mantiene dentro del alcance definido en el apartado 1.3. No acciona válvulas ni programadores y no pretende sustituir el criterio del técnico o del agricultor. Tampoco estima el riego óptimo medido en parcela, porque no se dispone de humedad del suelo, riego aplicado ni respuesta productiva. Lo que ofrece es una referencia hídrica razonada, acompañada de las reglas que la han modificado y de las advertencias que deben revisarse antes de regar, en línea con el planteamiento híbrido descrito en el apartado 2.3 (Navarro-Hellín et al., 2016; Zhai et al., 2020).</w:t>
+        <w:t>El sistema se mantiene dentro del alcance definido en el apartado 1.3. No acciona válvulas ni programadores y no pretende sustituir el criterio del técnico o del agricultor. Tampoco estima el riego óptimo medido en parcela, porque no se dispone de humedad del suelo, riego aplicado ni respuesta productiva. Una dosis recomendada en una fecha anterior no se considera riego realizado ni se descuenta automáticamente de la necesidad de una fecha posterior. Lo que ofrece es una referencia hídrica razonada, acompañada de las reglas que la han modificado y de las advertencias que deben revisarse antes de regar, en línea con el planteamiento híbrido descrito en el apartado 2.3 (Navarro-Hellín et al., 2016; Zhai et al., 2020).</w:t>
       </w:r>
     </w:p>
     <w:p>
       <w:pPr>
         <w:pStyle w:val="Ttulo3"/>
       </w:pPr>
-      <w:bookmarkStart w:id="55" w:name="_Toc243635494"/>
+      <w:bookmarkStart w:id="55" w:name="_Toc243638027"/>
       <w:r>
         <w:rPr>
           <w:sz w:val="24"/>
@@ -24298,7 +24298,7 @@
       <w:pPr>
         <w:pStyle w:val="Ttulo3"/>
       </w:pPr>
-      <w:bookmarkStart w:id="56" w:name="_Toc243635495"/>
+      <w:bookmarkStart w:id="56" w:name="_Toc243638028"/>
       <w:r>
         <w:rPr>
           <w:sz w:val="24"/>
@@ -24381,7 +24381,7 @@
       <w:pPr>
         <w:pStyle w:val="Ttulo3"/>
       </w:pPr>
-      <w:bookmarkStart w:id="57" w:name="_Toc243635496"/>
+      <w:bookmarkStart w:id="57" w:name="_Toc243638029"/>
       <w:r>
         <w:rPr>
           <w:sz w:val="24"/>
@@ -24430,7 +24430,7 @@
       <w:pPr>
         <w:pStyle w:val="Ttulo3"/>
       </w:pPr>
-      <w:bookmarkStart w:id="58" w:name="_Toc243635497"/>
+      <w:bookmarkStart w:id="58" w:name="_Toc243638030"/>
       <w:r>
         <w:rPr>
           <w:sz w:val="24"/>
@@ -25312,7 +25312,7 @@
       <w:pPr>
         <w:pStyle w:val="Ttulo3"/>
       </w:pPr>
-      <w:bookmarkStart w:id="59" w:name="_Toc243635498"/>
+      <w:bookmarkStart w:id="59" w:name="_Toc243638031"/>
       <w:r>
         <w:rPr>
           <w:sz w:val="24"/>
@@ -25335,7 +25335,7 @@
       <w:pPr>
         <w:pStyle w:val="Ttulo3"/>
       </w:pPr>
-      <w:bookmarkStart w:id="60" w:name="_Toc243635499"/>
+      <w:bookmarkStart w:id="60" w:name="_Toc243638032"/>
       <w:r>
         <w:rPr>
           <w:sz w:val="24"/>
@@ -25357,7 +25357,7 @@
       <w:pPr>
         <w:pStyle w:val="Ttulo2"/>
       </w:pPr>
-      <w:bookmarkStart w:id="61" w:name="_Toc243635500"/>
+      <w:bookmarkStart w:id="61" w:name="_Toc243638033"/>
       <w:r>
         <w:t>5.2. Aplicación y visualización de resultados</w:t>
       </w:r>
@@ -25372,7 +25372,7 @@
       <w:pPr>
         <w:pStyle w:val="Ttulo3"/>
       </w:pPr>
-      <w:bookmarkStart w:id="62" w:name="_Toc243635501"/>
+      <w:bookmarkStart w:id="62" w:name="_Toc243638034"/>
       <w:r>
         <w:rPr>
           <w:sz w:val="24"/>
@@ -25395,7 +25395,7 @@
       <w:pPr>
         <w:pStyle w:val="Ttulo3"/>
       </w:pPr>
-      <w:bookmarkStart w:id="63" w:name="_Toc243635502"/>
+      <w:bookmarkStart w:id="63" w:name="_Toc243638035"/>
       <w:r>
         <w:rPr>
           <w:sz w:val="24"/>
@@ -25427,7 +25427,7 @@
       <w:pPr>
         <w:pStyle w:val="Ttulo3"/>
       </w:pPr>
-      <w:bookmarkStart w:id="64" w:name="_Toc243635503"/>
+      <w:bookmarkStart w:id="64" w:name="_Toc243638036"/>
       <w:r>
         <w:rPr>
           <w:sz w:val="24"/>
@@ -27370,7 +27370,7 @@
       <w:pPr>
         <w:pStyle w:val="Ttulo3"/>
       </w:pPr>
-      <w:bookmarkStart w:id="65" w:name="_Toc243635504"/>
+      <w:bookmarkStart w:id="65" w:name="_Toc243638037"/>
       <w:r>
         <w:rPr>
           <w:sz w:val="24"/>
@@ -27404,7 +27404,7 @@
       <w:pPr>
         <w:pStyle w:val="Ttulo3"/>
       </w:pPr>
-      <w:bookmarkStart w:id="66" w:name="_Toc243635505"/>
+      <w:bookmarkStart w:id="66" w:name="_Toc243638038"/>
       <w:r>
         <w:rPr>
           <w:sz w:val="24"/>
@@ -27422,7 +27422,7 @@
       <w:pPr>
         <w:pStyle w:val="Ttulo3"/>
       </w:pPr>
-      <w:bookmarkStart w:id="67" w:name="_Toc243635506"/>
+      <w:bookmarkStart w:id="67" w:name="_Toc243638039"/>
       <w:r>
         <w:rPr>
           <w:sz w:val="24"/>
@@ -27440,7 +27440,7 @@
       <w:pPr>
         <w:pStyle w:val="Ttulo2"/>
       </w:pPr>
-      <w:bookmarkStart w:id="68" w:name="_Toc243635507"/>
+      <w:bookmarkStart w:id="68" w:name="_Toc243638040"/>
       <w:r>
         <w:t>5.3. Validación, resultados y análisis crítico</w:t>
       </w:r>
@@ -27464,7 +27464,7 @@
       <w:pPr>
         <w:pStyle w:val="Ttulo3"/>
       </w:pPr>
-      <w:bookmarkStart w:id="69" w:name="_Toc243635508"/>
+      <w:bookmarkStart w:id="69" w:name="_Toc243638041"/>
       <w:r>
         <w:rPr>
           <w:sz w:val="24"/>
@@ -27487,7 +27487,7 @@
       <w:pPr>
         <w:pStyle w:val="Ttulo3"/>
       </w:pPr>
-      <w:bookmarkStart w:id="70" w:name="_Toc243635509"/>
+      <w:bookmarkStart w:id="70" w:name="_Toc243638042"/>
       <w:r>
         <w:rPr>
           <w:sz w:val="24"/>
@@ -27993,7 +27993,7 @@
       <w:pPr>
         <w:pStyle w:val="Ttulo3"/>
       </w:pPr>
-      <w:bookmarkStart w:id="71" w:name="_Toc243635510"/>
+      <w:bookmarkStart w:id="71" w:name="_Toc243638043"/>
       <w:r>
         <w:rPr>
           <w:sz w:val="24"/>
@@ -28866,7 +28866,7 @@
       <w:pPr>
         <w:pStyle w:val="Ttulo3"/>
       </w:pPr>
-      <w:bookmarkStart w:id="72" w:name="_Toc243635511"/>
+      <w:bookmarkStart w:id="72" w:name="_Toc243638044"/>
       <w:r>
         <w:rPr>
           <w:sz w:val="24"/>
@@ -29966,7 +29966,7 @@
       <w:pPr>
         <w:pStyle w:val="Ttulo3"/>
       </w:pPr>
-      <w:bookmarkStart w:id="73" w:name="_Toc243635512"/>
+      <w:bookmarkStart w:id="73" w:name="_Toc243638045"/>
       <w:r>
         <w:rPr>
           <w:sz w:val="24"/>
@@ -30058,7 +30058,7 @@
       <w:pPr>
         <w:pStyle w:val="Ttulo3"/>
       </w:pPr>
-      <w:bookmarkStart w:id="74" w:name="_Toc243635513"/>
+      <w:bookmarkStart w:id="74" w:name="_Toc243638046"/>
       <w:r>
         <w:rPr>
           <w:sz w:val="24"/>
@@ -30513,7 +30513,7 @@
       <w:pPr>
         <w:pStyle w:val="Ttulo3"/>
       </w:pPr>
-      <w:bookmarkStart w:id="75" w:name="_Toc243635514"/>
+      <w:bookmarkStart w:id="75" w:name="_Toc243638047"/>
       <w:r>
         <w:rPr>
           <w:sz w:val="24"/>
@@ -31606,7 +31606,7 @@
       <w:pPr>
         <w:pStyle w:val="Ttulo3"/>
       </w:pPr>
-      <w:bookmarkStart w:id="76" w:name="_Toc243635515"/>
+      <w:bookmarkStart w:id="76" w:name="_Toc243638048"/>
       <w:r>
         <w:rPr>
           <w:sz w:val="24"/>
@@ -31624,7 +31624,7 @@
       <w:pPr>
         <w:pStyle w:val="Ttulo3"/>
       </w:pPr>
-      <w:bookmarkStart w:id="77" w:name="_Toc243635516"/>
+      <w:bookmarkStart w:id="77" w:name="_Toc243638049"/>
       <w:r>
         <w:rPr>
           <w:sz w:val="24"/>
@@ -31661,7 +31661,7 @@
       <w:pPr>
         <w:pStyle w:val="Ttulo3"/>
       </w:pPr>
-      <w:bookmarkStart w:id="78" w:name="_Toc243635517"/>
+      <w:bookmarkStart w:id="78" w:name="_Toc243638050"/>
       <w:r>
         <w:rPr>
           <w:sz w:val="24"/>
@@ -31715,7 +31715,7 @@
         <w:pStyle w:val="Ttulo1"/>
         <w:pageBreakBefore/>
       </w:pPr>
-      <w:bookmarkStart w:id="79" w:name="_Toc243635518"/>
+      <w:bookmarkStart w:id="79" w:name="_Toc243638051"/>
       <w:r>
         <w:lastRenderedPageBreak/>
         <w:t>6. Conclusiones</w:t>
@@ -31726,7 +31726,7 @@
       <w:pPr>
         <w:pStyle w:val="Ttulo2"/>
       </w:pPr>
-      <w:bookmarkStart w:id="80" w:name="_Toc243635519"/>
+      <w:bookmarkStart w:id="80" w:name="_Toc243638052"/>
       <w:r>
         <w:t>6.1. Cumplimiento de objetivos y aportaciones</w:t>
       </w:r>
@@ -31736,7 +31736,7 @@
       <w:pPr>
         <w:pStyle w:val="Ttulo3"/>
       </w:pPr>
-      <w:bookmarkStart w:id="81" w:name="_Toc243635520"/>
+      <w:bookmarkStart w:id="81" w:name="_Toc243638053"/>
       <w:r>
         <w:rPr>
           <w:sz w:val="24"/>
@@ -32534,7 +32534,7 @@
       <w:pPr>
         <w:pStyle w:val="Ttulo3"/>
       </w:pPr>
-      <w:bookmarkStart w:id="82" w:name="_Toc243635521"/>
+      <w:bookmarkStart w:id="82" w:name="_Toc243638054"/>
       <w:r>
         <w:rPr>
           <w:sz w:val="24"/>
@@ -32575,7 +32575,7 @@
       <w:pPr>
         <w:pStyle w:val="Ttulo2"/>
       </w:pPr>
-      <w:bookmarkStart w:id="83" w:name="_Toc243635522"/>
+      <w:bookmarkStart w:id="83" w:name="_Toc243638055"/>
       <w:r>
         <w:t>6.2. Limitaciones e impacto del proyecto</w:t>
       </w:r>
@@ -32585,7 +32585,7 @@
       <w:pPr>
         <w:pStyle w:val="Ttulo3"/>
       </w:pPr>
-      <w:bookmarkStart w:id="84" w:name="_Toc243635523"/>
+      <w:bookmarkStart w:id="84" w:name="_Toc243638056"/>
       <w:r>
         <w:rPr>
           <w:sz w:val="24"/>
@@ -32616,12 +32616,15 @@
     </w:p>
     <w:p>
       <w:r>
-        <w:t>La cuarta es funcional. El sistema decide cuánto regar, pero no cuándo, porque sin balance hídrico del suelo trata todas las necesidades como diarias. La restricción de agua se aplica mediante una reducción proporcional, que no reparte el déficit según la sensibilidad de cada fase del cultivo (Fereres &amp; Soriano, 2007). La aplicación, por su parte, trabaja con un caso fijo, no conserva un histórico de consultas y no se ha probado con agricultores ni técnicos.</w:t>
-      </w:r>
-    </w:p>
-    <w:p>
+        <w:t xml:space="preserve">La cuarta es funcional. El sistema propone una dosis diaria orientativa, pero no determina cuándo regar, porque no mantiene un balance hídrico del suelo. Tampoco conoce si una recomendación anterior llegó a aplicarse, por lo que no la trata como riego realizado ni la descuenta de la necesidad posterior. La restricción de agua se aplica mediante una reducción proporcional, que no reparte el déficit según la sensibilidad de cada fase del cultivo (Fereres &amp; Soriano, 2007). La </w:t>
+      </w:r>
       <w:r>
         <w:lastRenderedPageBreak/>
+        <w:t>aplicación, por su parte, trabaja con un caso fijo, no conserva un histórico de consultas y no se ha probado con agricultores ni técnicos.</w:t>
+      </w:r>
+    </w:p>
+    <w:p>
+      <w:r>
         <w:t>La quinta es de arquitectura y supone una desviación respecto al anteproyecto. MySQL, Apache Hop, Docker y PySpark no se han implementado, y el cuadro de mando en Power BI o Tableau se ha sustituido por una aplicación en Streamlit. Las razones se exponen en los apartados 3.2.2 y 5.2.1 y son defendibles para el volumen del piloto, pero deben declararse como lo que son: el prototipo demuestra el flujo de datos y de decisión, no una plataforma desplegable.</w:t>
       </w:r>
     </w:p>
@@ -33207,7 +33210,7 @@
       <w:pPr>
         <w:pStyle w:val="Ttulo3"/>
       </w:pPr>
-      <w:bookmarkStart w:id="85" w:name="_Toc243635524"/>
+      <w:bookmarkStart w:id="85" w:name="_Toc243638057"/>
       <w:r>
         <w:rPr>
           <w:sz w:val="24"/>
@@ -33223,11 +33226,8 @@
     </w:p>
     <w:p>
       <w:r>
-        <w:t xml:space="preserve">El primero es una capacidad funcional comprobada. El sistema transforma datos públicos y gratuitos en una dosis diaria y semanal expresada en milímetros y en metros cúbicos por parcela, acompañada de su explicación y sin necesidad de sensores. Su valor práctico se concentra en los </w:t>
-      </w:r>
-      <w:r>
         <w:lastRenderedPageBreak/>
-        <w:t>cambios de fase. En la semana analizada en el apartado 5.2.3, la persistencia habría planificado 6,77 mm menos de los que necesitó el cultivo, un 18 % de la referencia, justo al entrar en una fase de mayor demanda; el sistema se desvió un 4,9 %. Es el tipo de error que un calendario fijo o la repetición de la última dosis no ponen de manifiesto y que podría producir un déficit si se aplicara sin otros controles; el ejemplo retrospectivo no demuestra que ocurriera en una parcela.</w:t>
+        <w:t>El primero es una capacidad funcional comprobada. El sistema transforma datos públicos y gratuitos en una dosis diaria y semanal expresada en milímetros y en metros cúbicos por parcela, acompañada de su explicación y sin necesidad de sensores. Su valor práctico se concentra en los cambios de fase. En la semana analizada en el apartado 5.2.3, la persistencia habría planificado 6,77 mm menos de los que necesitó el cultivo, un 18 % de la referencia, justo al entrar en una fase de mayor demanda; el sistema se desvió un 4,9 %. Es el tipo de error que un calendario fijo o la repetición de la última dosis no ponen de manifiesto y que podría producir un déficit si se aplicara sin otros controles; el ejemplo retrospectivo no demuestra que ocurriera en una parcela.</w:t>
       </w:r>
     </w:p>
     <w:p>
@@ -33249,7 +33249,7 @@
       <w:pPr>
         <w:pStyle w:val="Ttulo2"/>
       </w:pPr>
-      <w:bookmarkStart w:id="86" w:name="_Toc243635525"/>
+      <w:bookmarkStart w:id="86" w:name="_Toc243638058"/>
       <w:r>
         <w:t>6.3. Mejoras y líneas futuras</w:t>
       </w:r>
@@ -33264,29 +33264,26 @@
       <w:pPr>
         <w:pStyle w:val="Ttulo3"/>
       </w:pPr>
-      <w:bookmarkStart w:id="87" w:name="_Toc243635526"/>
+      <w:bookmarkStart w:id="87" w:name="_Toc243638059"/>
       <w:r>
         <w:rPr>
           <w:sz w:val="24"/>
         </w:rPr>
+        <w:lastRenderedPageBreak/>
         <w:t>6.3.1. Ampliación de la evidencia</w:t>
       </w:r>
       <w:bookmarkEnd w:id="87"/>
     </w:p>
     <w:p>
       <w:r>
-        <w:t xml:space="preserve">La primera mejora consiste en ampliar los datos con varias campañas, estaciones de Almería y cultivos. La extracción meteorológica admite estación y periodo; las necesidades se aportan mediante un CSV SiAR y metadatos. La ETL ya exige selección explícita cuando hay varios </w:t>
-      </w:r>
-      <w:r>
-        <w:lastRenderedPageBreak/>
-        <w:t>archivos y rechaza estaciones o campañas incompatibles. Falta un catálogo seleccionable en la interfaz y comprobar la aplicabilidad agronómica de cada calendario. Con más campañas podrán reservarse bloques completos para evaluar generalización temporal y espacial (Roberts et al., 2017).</w:t>
+        <w:t>La primera mejora consiste en ampliar los datos con varias campañas, estaciones de Almería y cultivos. La extracción meteorológica admite estación y periodo; las necesidades se aportan mediante un CSV SiAR y metadatos. La ETL ya exige selección explícita cuando hay varios archivos y rechaza estaciones o campañas incompatibles. Falta un catálogo seleccionable en la interfaz y comprobar la aplicabilidad agronómica de cada calendario. Con más campañas podrán reservarse bloques completos para evaluar generalización temporal y espacial (Roberts et al., 2017).</w:t>
       </w:r>
     </w:p>
     <w:p>
       <w:pPr>
         <w:pStyle w:val="Ttulo3"/>
       </w:pPr>
-      <w:bookmarkStart w:id="88" w:name="_Toc243635527"/>
+      <w:bookmarkStart w:id="88" w:name="_Toc243638060"/>
       <w:r>
         <w:rPr>
           <w:sz w:val="24"/>
@@ -33307,19 +33304,22 @@
     </w:p>
     <w:p>
       <w:r>
-        <w:t>La tercera mejora del motor es un balance hídrico del suelo con agotamiento admisible, como el propuesto en FAO-56 (Allen et al., 1998). Permitiría decidir no solo cuánto sino cuándo regar y aprovechar la lluvia realmente almacenada en el suelo. Requiere la capacidad de retención, la profundidad radicular y el registro de riegos de cada parcela. Con esa información, la reducción proporcional por dotación podría sustituirse por una estrategia de riego deficitario que concentre el déficit en las fases menos sensibles del cultivo (Fereres &amp; Soriano, 2007).</w:t>
+        <w:t xml:space="preserve">La tercera mejora del motor es un balance hídrico del suelo con agotamiento admisible, como el propuesto en FAO-56 (Allen et al., 1998). Permitiría decidir no solo cuánto sino cuándo regar y aprovechar la lluvia realmente almacenada en el suelo. Requiere la capacidad de retención, la </w:t>
+      </w:r>
+      <w:r>
+        <w:lastRenderedPageBreak/>
+        <w:t>profundidad radicular y el registro de los riegos realmente aplicados en cada parcela: recomendar una dosis no prueba que se haya ejecutado. El balance podría adaptar mejor la recomendación a la situación de la parcela, pero cualquier mejora de precisión debería comprobarse con observaciones y ensayos de campo. Con esa información, la reducción proporcional por dotación podría sustituirse por una estrategia de riego deficitario que concentre el déficit en las fases menos sensibles del cultivo (Fereres &amp; Soriano, 2007).</w:t>
       </w:r>
     </w:p>
     <w:p>
       <w:pPr>
         <w:pStyle w:val="Ttulo3"/>
       </w:pPr>
-      <w:bookmarkStart w:id="89" w:name="_Toc243635528"/>
+      <w:bookmarkStart w:id="89" w:name="_Toc243638061"/>
       <w:r>
         <w:rPr>
           <w:sz w:val="24"/>
         </w:rPr>
-        <w:lastRenderedPageBreak/>
         <w:t>6.3.3. Validación en condiciones de uso</w:t>
       </w:r>
       <w:bookmarkEnd w:id="89"/>
@@ -33338,7 +33338,7 @@
       <w:pPr>
         <w:pStyle w:val="Ttulo3"/>
       </w:pPr>
-      <w:bookmarkStart w:id="90" w:name="_Toc243635529"/>
+      <w:bookmarkStart w:id="90" w:name="_Toc243638062"/>
       <w:r>
         <w:rPr>
           <w:sz w:val="24"/>
@@ -33356,7 +33356,7 @@
       <w:pPr>
         <w:pStyle w:val="Ttulo3"/>
       </w:pPr>
-      <w:bookmarkStart w:id="91" w:name="_Toc243635530"/>
+      <w:bookmarkStart w:id="91" w:name="_Toc243638063"/>
       <w:r>
         <w:rPr>
           <w:sz w:val="24"/>
@@ -33367,7 +33367,11 @@
     </w:p>
     <w:p>
       <w:r>
-        <w:t>El trabajo se planteó como la construcción de una cadena completa de datos y decisión, con el aprendizaje automático como uno de sus componentes. El piloto obliga a reconsiderar el papel de ese componente. Con los datos disponibles, la mejora no ha procedido del algoritmo, sino de estructurar correctamente el problema: separar lo incierto de lo conocido, impedir que la información futura contamine la evaluación y hacer visible la incertidumbre en lugar de esconderla. El aprendizaje automático conserva su lugar en el sistema, pero como herramienta para corregir una base física cuando existan datos suficientes, no como sustituto de ella. La frontera de mejora del proyecto no está, por tanto, en el modelo, sino en los datos: más campañas, predicciones archivadas y, sobre todo, información medida en las parcelas en las que se toma la decisión.</w:t>
+        <w:t xml:space="preserve">El trabajo se planteó como la construcción de una cadena completa de datos y decisión, con el aprendizaje automático como uno de sus componentes. El piloto obliga a reconsiderar el papel de ese componente. Con los datos disponibles, la mejora no ha procedido del algoritmo, sino de estructurar correctamente el problema: separar lo incierto de lo conocido, impedir que la </w:t>
+      </w:r>
+      <w:r>
+        <w:lastRenderedPageBreak/>
+        <w:t>información futura contamine la evaluación y hacer visible la incertidumbre en lugar de esconderla. El aprendizaje automático conserva su lugar en el sistema, pero como herramienta para corregir una base física cuando existan datos suficientes, no como sustituto de ella. La frontera de mejora del proyecto no está, por tanto, en el modelo, sino en los datos: más campañas, predicciones archivadas y, sobre todo, información medida en las parcelas en las que se toma la decisión.</w:t>
       </w:r>
     </w:p>
     <w:p>
@@ -33375,7 +33379,7 @@
         <w:pStyle w:val="Ttulo1"/>
         <w:pageBreakBefore/>
       </w:pPr>
-      <w:bookmarkStart w:id="92" w:name="_Toc243635531"/>
+      <w:bookmarkStart w:id="92" w:name="_Toc243638064"/>
       <w:r>
         <w:lastRenderedPageBreak/>
         <w:t>Referencias bibliográficas</w:t>
@@ -33920,7 +33924,7 @@
       <w:pPr>
         <w:pStyle w:val="Ttulo1"/>
       </w:pPr>
-      <w:bookmarkStart w:id="93" w:name="_Toc243635532"/>
+      <w:bookmarkStart w:id="93" w:name="_Toc243638065"/>
       <w:r>
         <w:lastRenderedPageBreak/>
         <w:t>Anexo A. Reproducción y localización de las evidencias</w:t>
@@ -33936,7 +33940,7 @@
       <w:pPr>
         <w:pStyle w:val="Ttulo2"/>
       </w:pPr>
-      <w:bookmarkStart w:id="94" w:name="_Toc243635533"/>
+      <w:bookmarkStart w:id="94" w:name="_Toc243638066"/>
       <w:r>
         <w:t>A.1. Archivos principales</w:t>
       </w:r>
@@ -34304,7 +34308,7 @@
       <w:pPr>
         <w:pStyle w:val="Ttulo2"/>
       </w:pPr>
-      <w:bookmarkStart w:id="95" w:name="_Toc243635534"/>
+      <w:bookmarkStart w:id="95" w:name="_Toc243638067"/>
       <w:r>
         <w:t>A.2. Secuencia mínima de reproducción</w:t>
       </w:r>

</xml_diff>